<commit_message>
before I edited too much
</commit_message>
<xml_diff>
--- a/Bahamonde_Sarpila.docx
+++ b/Bahamonde_Sarpila.docx
@@ -1924,14 +1924,49 @@
           <w:noProof/>
           <w:lang w:val="en-US"/>
         </w:rPr>
-        <w:t>affects turnout</w:t>
-      </w:r>
-      <w:r>
-        <w:rPr>
-          <w:noProof/>
-          <w:lang w:val="en-US"/>
-        </w:rPr>
-        <w:t xml:space="preserve"> for a candidate</w:t>
+        <w:t xml:space="preserve">affects </w:t>
+      </w:r>
+      <w:r>
+        <w:rPr>
+          <w:noProof/>
+          <w:lang w:val="en-US"/>
+        </w:rPr>
+        <w:t xml:space="preserve">the number of votes cast </w:t>
+      </w:r>
+      <w:r>
+        <w:rPr>
+          <w:noProof/>
+          <w:lang w:val="en-US"/>
+        </w:rPr>
+        <w:t xml:space="preserve">in favor </w:t>
+      </w:r>
+      <w:r>
+        <w:rPr>
+          <w:noProof/>
+          <w:lang w:val="en-US"/>
+        </w:rPr>
+        <w:t>of</w:t>
+      </w:r>
+      <w:r>
+        <w:rPr>
+          <w:noProof/>
+          <w:lang w:val="en-US"/>
+        </w:rPr>
+        <w:t xml:space="preserve"> a </w:t>
+      </w:r>
+      <w:r>
+        <w:rPr>
+          <w:noProof/>
+          <w:lang w:val="en-US"/>
+        </w:rPr>
+        <w:t xml:space="preserve">particular </w:t>
+      </w:r>
+      <w:r>
+        <w:rPr>
+          <w:noProof/>
+          <w:lang w:val="en-US"/>
+        </w:rPr>
+        <w:t>candidate</w:t>
       </w:r>
       <w:r>
         <w:rPr>
@@ -2288,21 +2323,7 @@
           <w:noProof/>
           <w:lang w:val="en-US"/>
         </w:rPr>
-        <w:t xml:space="preserve">. That is, Finns systematically punish working-class candidates in the voting booth, but even more so if the candidate is female </w:t>
-      </w:r>
-      <w:r>
-        <w:rPr>
-          <w:noProof/>
-          <w:lang w:val="en-US"/>
-        </w:rPr>
-        <w:t xml:space="preserve">and </w:t>
-      </w:r>
-      <w:r>
-        <w:rPr>
-          <w:noProof/>
-          <w:lang w:val="en-US"/>
-        </w:rPr>
-        <w:t xml:space="preserve">working-class. </w:t>
+        <w:t xml:space="preserve">. That is, Finns systematically punish working-class candidates in the voting booth, but even more so if the candidate is female. </w:t>
       </w:r>
     </w:p>
     <w:p>
@@ -2467,7 +2488,7 @@
           <w:noProof/>
           <w:lang w:val="en-US"/>
         </w:rPr>
-        <w:t xml:space="preserve"> into the political science literature, we hope to bridge the current gap between physical appearance and inequality </w:t>
+        <w:t xml:space="preserve">, we hope to bridge the current gap between physical appearance and inequality </w:t>
       </w:r>
       <w:hyperlink r:id="rId26">
         <w:r>
@@ -2483,7 +2504,7 @@
           <w:noProof/>
           <w:lang w:val="en-US"/>
         </w:rPr>
-        <w:t xml:space="preserve">. Second, this paper seeks to contribute to the candidate evaluation literature in political science, particularly by presenting an alternative framework used by voters, </w:t>
+        <w:t xml:space="preserve">. Second, this paper seeks to contribute to the candidate evaluation literature, particularly by presenting an alternative framework used by voters, </w:t>
       </w:r>
       <w:r>
         <w:rPr>
@@ -2900,21 +2921,7 @@
           <w:noProof/>
           <w:lang w:val="en-US"/>
         </w:rPr>
-        <w:t xml:space="preserve">The </w:t>
-      </w:r>
-      <w:r>
-        <w:rPr>
-          <w:noProof/>
-          <w:lang w:val="en-US"/>
-        </w:rPr>
-        <w:t xml:space="preserve">political science </w:t>
-      </w:r>
-      <w:r>
-        <w:rPr>
-          <w:noProof/>
-          <w:lang w:val="en-US"/>
-        </w:rPr>
-        <w:t xml:space="preserve">literature confirmed long ago the stylized fact that physically attractive political candidates </w:t>
+        <w:t xml:space="preserve">The literature confirmed long ago the stylized fact that physically attractive political candidates </w:t>
       </w:r>
       <w:r>
         <w:rPr>
@@ -3075,7 +3082,21 @@
           <w:noProof/>
           <w:lang w:val="en-US"/>
         </w:rPr>
-        <w:t xml:space="preserve">, the relationship between looks and turnout is not only old </w:t>
+        <w:t xml:space="preserve">, the relationship between looks and </w:t>
+      </w:r>
+      <w:r>
+        <w:rPr>
+          <w:noProof/>
+          <w:lang w:val="en-US"/>
+        </w:rPr>
+        <w:t>electoral sucess</w:t>
+      </w:r>
+      <w:r>
+        <w:rPr>
+          <w:noProof/>
+          <w:lang w:val="en-US"/>
+        </w:rPr>
+        <w:t xml:space="preserve"> is not only old </w:t>
       </w:r>
       <w:hyperlink r:id="rId33">
         <w:r>
@@ -3261,7 +3282,6 @@
           <w:noProof/>
           <w:lang w:val="en-US"/>
         </w:rPr>
-        <w:lastRenderedPageBreak/>
         <w:t xml:space="preserve">This idea </w:t>
       </w:r>
       <w:r>
@@ -3372,7 +3392,15 @@
             <w:noProof/>
             <w:lang w:val="en-US"/>
           </w:rPr>
-          <w:t>(see also Hamermesh &amp; Biddle, 1994; Scholz &amp; Sicinski, 2015)</w:t>
+          <w:t xml:space="preserve">(see </w:t>
+        </w:r>
+        <w:r>
+          <w:rPr>
+            <w:noProof/>
+            <w:lang w:val="en-US"/>
+          </w:rPr>
+          <w:lastRenderedPageBreak/>
+          <w:t>also Hamermesh &amp; Biddle, 1994; Scholz &amp; Sicinski, 2015)</w:t>
         </w:r>
       </w:hyperlink>
       <w:r>
@@ -4384,15 +4412,7 @@
           <w:noProof/>
           <w:lang w:val="en-US"/>
         </w:rPr>
-        <w:t xml:space="preserve">. All in all, voters use heuristics because it allows them to make reasonable voting decisions with minimal cognitive effort and makes them “vote correctly,” </w:t>
-      </w:r>
-      <w:r>
-        <w:rPr>
-          <w:noProof/>
-          <w:lang w:val="en-US"/>
-        </w:rPr>
-        <w:lastRenderedPageBreak/>
-        <w:t xml:space="preserve">especially </w:t>
+        <w:t xml:space="preserve">. All in all, voters use heuristics because it allows them to make reasonable voting decisions with minimal cognitive effort and makes them “vote correctly,” especially </w:t>
       </w:r>
       <w:r>
         <w:rPr>
@@ -4474,6 +4494,7 @@
           <w:noProof/>
           <w:lang w:val="en-US"/>
         </w:rPr>
+        <w:lastRenderedPageBreak/>
         <w:t xml:space="preserve">We posit that “voters vote beautiful” </w:t>
       </w:r>
       <w:hyperlink r:id="rId65">
@@ -4673,7 +4694,7 @@
           <w:noProof/>
           <w:lang w:val="en-US"/>
         </w:rPr>
-        <w:t xml:space="preserve">Unfortunately, most studies in political science fail to see this association as it relates to inequality and social stratification. </w:t>
+        <w:t xml:space="preserve">Unfortunately, most studies fail to see this association as it relates to inequality and social stratification. </w:t>
       </w:r>
       <w:r>
         <w:rPr>
@@ -4813,7 +4834,21 @@
           <w:noProof/>
           <w:lang w:val="en-US"/>
         </w:rPr>
-        <w:t>physical attractiveness, neglecting other aspects of physical appearance that might also explain turnout. In this paper</w:t>
+        <w:t xml:space="preserve">physical attractiveness, neglecting other aspects of physical appearance that might also explain </w:t>
+      </w:r>
+      <w:r>
+        <w:rPr>
+          <w:noProof/>
+          <w:lang w:val="en-US"/>
+        </w:rPr>
+        <w:t>voting choices</w:t>
+      </w:r>
+      <w:r>
+        <w:rPr>
+          <w:noProof/>
+          <w:lang w:val="en-US"/>
+        </w:rPr>
+        <w:t>. In this paper</w:t>
       </w:r>
       <w:r>
         <w:rPr>
@@ -4841,7 +4876,49 @@
           <w:noProof/>
           <w:lang w:val="en-US"/>
         </w:rPr>
-        <w:t xml:space="preserve"> and inequality. The idea is to contribute to the political science literature by expanding the conceptual framework exploited in the paper.</w:t>
+        <w:t xml:space="preserve"> and inequality. The idea is to contribute to the literature by </w:t>
+      </w:r>
+      <w:r>
+        <w:rPr>
+          <w:noProof/>
+          <w:lang w:val="en-US"/>
+        </w:rPr>
+        <w:t xml:space="preserve">presenting </w:t>
+      </w:r>
+      <w:r>
+        <w:rPr>
+          <w:noProof/>
+          <w:lang w:val="en-US"/>
+        </w:rPr>
+        <w:t xml:space="preserve">the conceptual framework </w:t>
+      </w:r>
+      <w:r>
+        <w:rPr>
+          <w:noProof/>
+          <w:lang w:val="en-US"/>
+        </w:rPr>
+        <w:t>leveraged</w:t>
+      </w:r>
+      <w:r>
+        <w:rPr>
+          <w:noProof/>
+          <w:lang w:val="en-US"/>
+        </w:rPr>
+        <w:t xml:space="preserve"> in </w:t>
+      </w:r>
+      <w:r>
+        <w:rPr>
+          <w:noProof/>
+          <w:lang w:val="en-US"/>
+        </w:rPr>
+        <w:t xml:space="preserve">this </w:t>
+      </w:r>
+      <w:r>
+        <w:rPr>
+          <w:noProof/>
+          <w:lang w:val="en-US"/>
+        </w:rPr>
+        <w:t>paper.</w:t>
       </w:r>
     </w:p>
     <w:p>
@@ -5147,7 +5224,21 @@
           <w:noProof/>
           <w:lang w:val="en-US"/>
         </w:rPr>
-        <w:t xml:space="preserve">producing mechanism of status takes place in social interactions, where cultural beliefs </w:t>
+        <w:t xml:space="preserve">producing mechanism of status takes place in social interactions, where </w:t>
+      </w:r>
+      <w:r>
+        <w:rPr>
+          <w:noProof/>
+          <w:lang w:val="en-US"/>
+        </w:rPr>
+        <w:t>norms</w:t>
+      </w:r>
+      <w:r>
+        <w:rPr>
+          <w:noProof/>
+          <w:lang w:val="en-US"/>
+        </w:rPr>
+        <w:t xml:space="preserve"> </w:t>
       </w:r>
       <w:r>
         <w:rPr>
@@ -5184,7 +5275,21 @@
           <w:noProof/>
           <w:lang w:val="en-US"/>
         </w:rPr>
-        <w:t>. Cultural beliefs are shared stereotypes</w:t>
+        <w:t xml:space="preserve">. </w:t>
+      </w:r>
+      <w:r>
+        <w:rPr>
+          <w:noProof/>
+          <w:lang w:val="en-US"/>
+        </w:rPr>
+        <w:t>Social norms</w:t>
+      </w:r>
+      <w:r>
+        <w:rPr>
+          <w:noProof/>
+          <w:lang w:val="en-US"/>
+        </w:rPr>
+        <w:t xml:space="preserve"> are shared stereotypes</w:t>
       </w:r>
       <w:r>
         <w:rPr>
@@ -5234,15 +5339,7 @@
             <w:noProof/>
             <w:lang w:val="en-US"/>
           </w:rPr>
-          <w:t xml:space="preserve">(Ridgeway, </w:t>
-        </w:r>
-        <w:r>
-          <w:rPr>
-            <w:noProof/>
-            <w:lang w:val="en-US"/>
-          </w:rPr>
-          <w:lastRenderedPageBreak/>
-          <w:t>2011, 2014; Ridgeway &amp; Correll, 2004)</w:t>
+          <w:t>(Ridgeway, 2011, 2014; Ridgeway &amp; Correll, 2004)</w:t>
         </w:r>
       </w:hyperlink>
       <w:r>
@@ -5299,7 +5396,15 @@
           <w:noProof/>
           <w:lang w:val="en-US"/>
         </w:rPr>
-        <w:t xml:space="preserve"> lower performance, that is, lower turnout. Thus, they are also less likely to be given opportunities to perform and take care of collective tasks, </w:t>
+        <w:t xml:space="preserve"> lower performance, that is, lower turnout. </w:t>
+      </w:r>
+      <w:r>
+        <w:rPr>
+          <w:noProof/>
+          <w:lang w:val="en-US"/>
+        </w:rPr>
+        <w:lastRenderedPageBreak/>
+        <w:t xml:space="preserve">Thus, they are also less likely to be given opportunities to perform and take care of collective tasks, </w:t>
       </w:r>
       <w:r>
         <w:rPr>
@@ -5343,8 +5448,6 @@
         <w:jc w:val="both"/>
         <w:rPr>
           <w:noProof/>
-          <w:sz w:val="16"/>
-          <w:szCs w:val="16"/>
           <w:lang w:val="en-US"/>
         </w:rPr>
       </w:pPr>
@@ -5690,21 +5793,7 @@
           <w:noProof/>
           <w:lang w:val="en-US"/>
         </w:rPr>
-        <w:t xml:space="preserve"> projects. What sociologists in the field of social stratification have neglected,</w:t>
-      </w:r>
-      <w:r>
-        <w:rPr>
-          <w:noProof/>
-          <w:lang w:val="en-US"/>
-        </w:rPr>
-        <w:t xml:space="preserve"> however,</w:t>
-      </w:r>
-      <w:r>
-        <w:rPr>
-          <w:noProof/>
-          <w:lang w:val="en-US"/>
-        </w:rPr>
-        <w:t xml:space="preserve"> is the physical component of occupational status. </w:t>
+        <w:t xml:space="preserve"> projects.</w:t>
       </w:r>
     </w:p>
     <w:p>
@@ -6475,7 +6564,121 @@
           <w:noProof/>
           <w:lang w:val="en-US"/>
         </w:rPr>
-        <w:t xml:space="preserve">suggested that attractiveness is a gender-specific status </w:t>
+        <w:t xml:space="preserve">suggested that attractiveness is a gender-specific status symbol, </w:t>
+      </w:r>
+      <w:r>
+        <w:rPr>
+          <w:noProof/>
+          <w:lang w:val="en-US"/>
+        </w:rPr>
+        <w:t>whose</w:t>
+      </w:r>
+      <w:r>
+        <w:rPr>
+          <w:noProof/>
+          <w:lang w:val="en-US"/>
+        </w:rPr>
+        <w:t xml:space="preserve"> </w:t>
+      </w:r>
+      <w:r>
+        <w:rPr>
+          <w:noProof/>
+          <w:lang w:val="en-US"/>
+        </w:rPr>
+        <w:t xml:space="preserve">use is </w:t>
+      </w:r>
+      <w:r>
+        <w:rPr>
+          <w:noProof/>
+          <w:lang w:val="en-US"/>
+        </w:rPr>
+        <w:t>nonetheless</w:t>
+      </w:r>
+      <w:r>
+        <w:rPr>
+          <w:noProof/>
+          <w:lang w:val="en-US"/>
+        </w:rPr>
+        <w:t xml:space="preserve"> </w:t>
+      </w:r>
+      <w:r>
+        <w:rPr>
+          <w:noProof/>
+          <w:lang w:val="en-US"/>
+        </w:rPr>
+        <w:t xml:space="preserve">limited </w:t>
+      </w:r>
+      <w:r>
+        <w:rPr>
+          <w:noProof/>
+          <w:lang w:val="en-US"/>
+        </w:rPr>
+        <w:t>by</w:t>
+      </w:r>
+      <w:r>
+        <w:rPr>
+          <w:noProof/>
+          <w:lang w:val="en-US"/>
+        </w:rPr>
+        <w:t xml:space="preserve"> moral restrictions. More recent empirical research has shown that physical attractiveness intersects with gender</w:t>
+      </w:r>
+      <w:r>
+        <w:rPr>
+          <w:noProof/>
+          <w:lang w:val="en-US"/>
+        </w:rPr>
+        <w:t>,</w:t>
+      </w:r>
+      <w:r>
+        <w:rPr>
+          <w:noProof/>
+          <w:lang w:val="en-US"/>
+        </w:rPr>
+        <w:t xml:space="preserve"> producing unfavorable outcomes for women </w:t>
+      </w:r>
+      <w:hyperlink r:id="rId94">
+        <w:r>
+          <w:rPr>
+            <w:noProof/>
+            <w:lang w:val="en-US"/>
+          </w:rPr>
+          <w:t>(Frevert &amp; Walker, 2014; Heilman &amp; Eagly, 2008; Kuwabara &amp; Thébaud, 2017)</w:t>
+        </w:r>
+      </w:hyperlink>
+      <w:r>
+        <w:rPr>
+          <w:noProof/>
+          <w:lang w:val="en-US"/>
+        </w:rPr>
+        <w:t xml:space="preserve">. More specifically, a recent review </w:t>
+      </w:r>
+      <w:r>
+        <w:rPr>
+          <w:noProof/>
+          <w:lang w:val="en-US"/>
+        </w:rPr>
+        <w:t>of</w:t>
+      </w:r>
+      <w:r>
+        <w:rPr>
+          <w:noProof/>
+          <w:lang w:val="en-US"/>
+        </w:rPr>
+        <w:t xml:space="preserve"> </w:t>
+      </w:r>
+      <w:r>
+        <w:rPr>
+          <w:noProof/>
+          <w:lang w:val="en-US"/>
+        </w:rPr>
+        <w:t xml:space="preserve">the </w:t>
+      </w:r>
+      <w:r>
+        <w:rPr>
+          <w:noProof/>
+          <w:lang w:val="en-US"/>
+        </w:rPr>
+        <w:t xml:space="preserve">socio-economic outcomes of physical </w:t>
       </w:r>
       <w:r>
         <w:rPr>
@@ -6483,121 +6686,7 @@
           <w:lang w:val="en-US"/>
         </w:rPr>
         <w:lastRenderedPageBreak/>
-        <w:t xml:space="preserve">symbol, </w:t>
-      </w:r>
-      <w:r>
-        <w:rPr>
-          <w:noProof/>
-          <w:lang w:val="en-US"/>
-        </w:rPr>
-        <w:t>whose</w:t>
-      </w:r>
-      <w:r>
-        <w:rPr>
-          <w:noProof/>
-          <w:lang w:val="en-US"/>
-        </w:rPr>
-        <w:t xml:space="preserve"> </w:t>
-      </w:r>
-      <w:r>
-        <w:rPr>
-          <w:noProof/>
-          <w:lang w:val="en-US"/>
-        </w:rPr>
-        <w:t xml:space="preserve">use is </w:t>
-      </w:r>
-      <w:r>
-        <w:rPr>
-          <w:noProof/>
-          <w:lang w:val="en-US"/>
-        </w:rPr>
-        <w:t>nonetheless</w:t>
-      </w:r>
-      <w:r>
-        <w:rPr>
-          <w:noProof/>
-          <w:lang w:val="en-US"/>
-        </w:rPr>
-        <w:t xml:space="preserve"> </w:t>
-      </w:r>
-      <w:r>
-        <w:rPr>
-          <w:noProof/>
-          <w:lang w:val="en-US"/>
-        </w:rPr>
-        <w:t xml:space="preserve">limited </w:t>
-      </w:r>
-      <w:r>
-        <w:rPr>
-          <w:noProof/>
-          <w:lang w:val="en-US"/>
-        </w:rPr>
-        <w:t>by</w:t>
-      </w:r>
-      <w:r>
-        <w:rPr>
-          <w:noProof/>
-          <w:lang w:val="en-US"/>
-        </w:rPr>
-        <w:t xml:space="preserve"> moral restrictions. More recent empirical research has shown that physical attractiveness intersects with gender</w:t>
-      </w:r>
-      <w:r>
-        <w:rPr>
-          <w:noProof/>
-          <w:lang w:val="en-US"/>
-        </w:rPr>
-        <w:t>,</w:t>
-      </w:r>
-      <w:r>
-        <w:rPr>
-          <w:noProof/>
-          <w:lang w:val="en-US"/>
-        </w:rPr>
-        <w:t xml:space="preserve"> producing unfavorable outcomes for women </w:t>
-      </w:r>
-      <w:hyperlink r:id="rId94">
-        <w:r>
-          <w:rPr>
-            <w:noProof/>
-            <w:lang w:val="en-US"/>
-          </w:rPr>
-          <w:t>(Frevert &amp; Walker, 2014; Heilman &amp; Eagly, 2008; Kuwabara &amp; Thébaud, 2017)</w:t>
-        </w:r>
-      </w:hyperlink>
-      <w:r>
-        <w:rPr>
-          <w:noProof/>
-          <w:lang w:val="en-US"/>
-        </w:rPr>
-        <w:t xml:space="preserve">. More specifically, a recent review </w:t>
-      </w:r>
-      <w:r>
-        <w:rPr>
-          <w:noProof/>
-          <w:lang w:val="en-US"/>
-        </w:rPr>
-        <w:t>of</w:t>
-      </w:r>
-      <w:r>
-        <w:rPr>
-          <w:noProof/>
-          <w:lang w:val="en-US"/>
-        </w:rPr>
-        <w:t xml:space="preserve"> </w:t>
-      </w:r>
-      <w:r>
-        <w:rPr>
-          <w:noProof/>
-          <w:lang w:val="en-US"/>
-        </w:rPr>
-        <w:t xml:space="preserve">the </w:t>
-      </w:r>
-      <w:r>
-        <w:rPr>
-          <w:noProof/>
-          <w:lang w:val="en-US"/>
-        </w:rPr>
-        <w:t xml:space="preserve">socio-economic outcomes of physical attractiveness </w:t>
+        <w:t xml:space="preserve">attractiveness </w:t>
       </w:r>
       <w:r>
         <w:rPr>
@@ -7794,7 +7883,75 @@
           <w:noProof/>
           <w:lang w:val="en-US"/>
         </w:rPr>
-        <w:t xml:space="preserve"> of the candidates running for office along with their name </w:t>
+        <w:t xml:space="preserve"> of the candidates running for office along with their name and party affiliation. This information is public and shown in city centers, bus stops, public squares</w:t>
+      </w:r>
+      <w:r>
+        <w:rPr>
+          <w:noProof/>
+          <w:lang w:val="en-US"/>
+        </w:rPr>
+        <w:t>,</w:t>
+      </w:r>
+      <w:r>
+        <w:rPr>
+          <w:noProof/>
+          <w:lang w:val="en-US"/>
+        </w:rPr>
+        <w:t xml:space="preserve"> and other highly frequented places, including voting booths </w:t>
+      </w:r>
+      <w:hyperlink r:id="rId104">
+        <w:r>
+          <w:rPr>
+            <w:noProof/>
+            <w:lang w:val="en-US"/>
+          </w:rPr>
+          <w:t>(Berggren et al., 2010, p. 12)</w:t>
+        </w:r>
+      </w:hyperlink>
+      <w:r>
+        <w:rPr>
+          <w:noProof/>
+          <w:lang w:val="en-US"/>
+        </w:rPr>
+        <w:t xml:space="preserve">. Importantly, the </w:t>
+      </w:r>
+      <w:r>
+        <w:rPr>
+          <w:i/>
+          <w:noProof/>
+          <w:lang w:val="en-US"/>
+        </w:rPr>
+        <w:t>same</w:t>
+      </w:r>
+      <w:r>
+        <w:rPr>
+          <w:noProof/>
+          <w:lang w:val="en-US"/>
+        </w:rPr>
+        <w:t xml:space="preserve"> photos are also displayed in newspaper ads </w:t>
+      </w:r>
+      <w:hyperlink r:id="rId105">
+        <w:r>
+          <w:rPr>
+            <w:noProof/>
+            <w:lang w:val="en-US"/>
+          </w:rPr>
+          <w:t>(Berggren et al., 2010, p. 10)</w:t>
+        </w:r>
+      </w:hyperlink>
+      <w:r>
+        <w:rPr>
+          <w:noProof/>
+          <w:lang w:val="en-US"/>
+        </w:rPr>
+        <w:t>,</w:t>
+      </w:r>
+      <w:r>
+        <w:rPr>
+          <w:noProof/>
+          <w:lang w:val="en-US"/>
+        </w:rPr>
+        <w:t xml:space="preserve"> and “each municipality is obliged by law to provide each party with the same </w:t>
       </w:r>
       <w:r>
         <w:rPr>
@@ -7802,75 +7959,7 @@
           <w:lang w:val="en-US"/>
         </w:rPr>
         <w:lastRenderedPageBreak/>
-        <w:t>and party affiliation. This information is public and shown in city centers, bus stops, public squares</w:t>
-      </w:r>
-      <w:r>
-        <w:rPr>
-          <w:noProof/>
-          <w:lang w:val="en-US"/>
-        </w:rPr>
-        <w:t>,</w:t>
-      </w:r>
-      <w:r>
-        <w:rPr>
-          <w:noProof/>
-          <w:lang w:val="en-US"/>
-        </w:rPr>
-        <w:t xml:space="preserve"> and other highly frequented places, including voting booths </w:t>
-      </w:r>
-      <w:hyperlink r:id="rId104">
-        <w:r>
-          <w:rPr>
-            <w:noProof/>
-            <w:lang w:val="en-US"/>
-          </w:rPr>
-          <w:t>(Berggren et al., 2010, p. 12)</w:t>
-        </w:r>
-      </w:hyperlink>
-      <w:r>
-        <w:rPr>
-          <w:noProof/>
-          <w:lang w:val="en-US"/>
-        </w:rPr>
-        <w:t xml:space="preserve">. Importantly, the </w:t>
-      </w:r>
-      <w:r>
-        <w:rPr>
-          <w:i/>
-          <w:noProof/>
-          <w:lang w:val="en-US"/>
-        </w:rPr>
-        <w:t>same</w:t>
-      </w:r>
-      <w:r>
-        <w:rPr>
-          <w:noProof/>
-          <w:lang w:val="en-US"/>
-        </w:rPr>
-        <w:t xml:space="preserve"> photos are also displayed in newspaper ads </w:t>
-      </w:r>
-      <w:hyperlink r:id="rId105">
-        <w:r>
-          <w:rPr>
-            <w:noProof/>
-            <w:lang w:val="en-US"/>
-          </w:rPr>
-          <w:t>(Berggren et al., 2010, p. 10)</w:t>
-        </w:r>
-      </w:hyperlink>
-      <w:r>
-        <w:rPr>
-          <w:noProof/>
-          <w:lang w:val="en-US"/>
-        </w:rPr>
-        <w:t>,</w:t>
-      </w:r>
-      <w:r>
-        <w:rPr>
-          <w:noProof/>
-          <w:lang w:val="en-US"/>
-        </w:rPr>
-        <w:t xml:space="preserve"> and “each municipality is obliged by law to provide each party with the same number of slots for posters” </w:t>
+        <w:t xml:space="preserve">number of slots for posters” </w:t>
       </w:r>
       <w:hyperlink r:id="rId106">
         <w:r>
@@ -20877,25 +20966,7 @@
           <w:szCs w:val="20"/>
           <w:lang w:val="en-US"/>
         </w:rPr>
-        <w:t xml:space="preserve">uthors are listed in alphabetical order. Hector </w:t>
-      </w:r>
-      <w:proofErr w:type="spellStart"/>
-      <w:r>
-        <w:rPr>
-          <w:sz w:val="20"/>
-          <w:szCs w:val="20"/>
-          <w:lang w:val="en-US"/>
-        </w:rPr>
-        <w:t>Bahamonde</w:t>
-      </w:r>
-      <w:proofErr w:type="spellEnd"/>
-      <w:r>
-        <w:rPr>
-          <w:sz w:val="20"/>
-          <w:szCs w:val="20"/>
-          <w:lang w:val="en-US"/>
-        </w:rPr>
-        <w:t xml:space="preserve"> is a Senior Researcher at the University of Turku</w:t>
+        <w:t>uthors are listed in alphabetical order. Hector Bahamonde is a Senior Researcher at the University of Turku</w:t>
       </w:r>
       <w:r>
         <w:rPr>
@@ -20967,43 +21038,7 @@
           <w:szCs w:val="20"/>
           <w:lang w:val="en-US"/>
         </w:rPr>
-        <w:t xml:space="preserve">). </w:t>
-      </w:r>
-      <w:proofErr w:type="spellStart"/>
-      <w:r>
-        <w:rPr>
-          <w:sz w:val="20"/>
-          <w:szCs w:val="20"/>
-          <w:lang w:val="en-US"/>
-        </w:rPr>
-        <w:t>Outi</w:t>
-      </w:r>
-      <w:proofErr w:type="spellEnd"/>
-      <w:r>
-        <w:rPr>
-          <w:sz w:val="20"/>
-          <w:szCs w:val="20"/>
-          <w:lang w:val="en-US"/>
-        </w:rPr>
-        <w:t xml:space="preserve"> </w:t>
-      </w:r>
-      <w:proofErr w:type="spellStart"/>
-      <w:r>
-        <w:rPr>
-          <w:sz w:val="20"/>
-          <w:szCs w:val="20"/>
-          <w:lang w:val="en-US"/>
-        </w:rPr>
-        <w:t>Sarpila</w:t>
-      </w:r>
-      <w:proofErr w:type="spellEnd"/>
-      <w:r>
-        <w:rPr>
-          <w:sz w:val="20"/>
-          <w:szCs w:val="20"/>
-          <w:lang w:val="en-US"/>
-        </w:rPr>
-        <w:t xml:space="preserve"> (</w:t>
+        <w:t>). Outi Sarpila (</w:t>
       </w:r>
       <w:hyperlink r:id="rId3">
         <w:r>
@@ -21047,25 +21082,23 @@
           <w:szCs w:val="20"/>
           <w:lang w:val="en-US"/>
         </w:rPr>
-        <w:t xml:space="preserve"> Richard Lau, David </w:t>
-      </w:r>
-      <w:proofErr w:type="spellStart"/>
+        <w:t xml:space="preserve"> Richard Lau, David Redlawsk, Tessa di Tonto, and</w:t>
+      </w:r>
       <w:r>
         <w:rPr>
           <w:sz w:val="20"/>
           <w:szCs w:val="20"/>
           <w:lang w:val="en-US"/>
         </w:rPr>
-        <w:t>Redlawsk</w:t>
-      </w:r>
-      <w:proofErr w:type="spellEnd"/>
+        <w:t xml:space="preserve"> the participants and organizers of the talks at the 2022 INVEST Research Seminar (Turku, Finland), the 2022 SOMA Workshop (Svartå, Finland), and the 2022 Nordic Sociological Association Conference (Reykjavik, Iceland). This project was funded by Sarpila’s Academy of Finland </w:t>
+      </w:r>
       <w:r>
         <w:rPr>
           <w:sz w:val="20"/>
           <w:szCs w:val="20"/>
           <w:lang w:val="en-US"/>
         </w:rPr>
-        <w:t>, Tessa di Tonto, and</w:t>
+        <w:t>(</w:t>
       </w:r>
       <w:r>
         <w:rPr>
@@ -21073,87 +21106,16 @@
           <w:szCs w:val="20"/>
           <w:lang w:val="en-US"/>
         </w:rPr>
-        <w:t xml:space="preserve"> the participants and organizers of the talks at the 2022 INVEST Research Seminar (Turku, Finland), the 2022 SOMA Workshop (</w:t>
-      </w:r>
-      <w:proofErr w:type="spellStart"/>
+        <w:t>decision number 325813</w:t>
+      </w:r>
       <w:r>
         <w:rPr>
           <w:sz w:val="20"/>
           <w:szCs w:val="20"/>
           <w:lang w:val="en-US"/>
         </w:rPr>
-        <w:t>Svartå</w:t>
-      </w:r>
-      <w:proofErr w:type="spellEnd"/>
-      <w:r>
-        <w:rPr>
-          <w:sz w:val="20"/>
-          <w:szCs w:val="20"/>
-          <w:lang w:val="en-US"/>
-        </w:rPr>
-        <w:t xml:space="preserve">, Finland), and the 2022 Nordic Sociological Association Conference (Reykjavik, Iceland). This project was funded by </w:t>
-      </w:r>
-      <w:proofErr w:type="spellStart"/>
-      <w:r>
-        <w:rPr>
-          <w:sz w:val="20"/>
-          <w:szCs w:val="20"/>
-          <w:lang w:val="en-US"/>
-        </w:rPr>
-        <w:t>Sarpila’s</w:t>
-      </w:r>
-      <w:proofErr w:type="spellEnd"/>
-      <w:r>
-        <w:rPr>
-          <w:sz w:val="20"/>
-          <w:szCs w:val="20"/>
-          <w:lang w:val="en-US"/>
-        </w:rPr>
-        <w:t xml:space="preserve"> Academy of Finland </w:t>
-      </w:r>
-      <w:r>
-        <w:rPr>
-          <w:sz w:val="20"/>
-          <w:szCs w:val="20"/>
-          <w:lang w:val="en-US"/>
-        </w:rPr>
-        <w:t>(</w:t>
-      </w:r>
-      <w:r>
-        <w:rPr>
-          <w:sz w:val="20"/>
-          <w:szCs w:val="20"/>
-          <w:lang w:val="en-US"/>
-        </w:rPr>
-        <w:t>decision number 325813</w:t>
-      </w:r>
-      <w:r>
-        <w:rPr>
-          <w:sz w:val="20"/>
-          <w:szCs w:val="20"/>
-          <w:lang w:val="en-US"/>
-        </w:rPr>
-        <w:t xml:space="preserve">) and by </w:t>
-      </w:r>
-      <w:proofErr w:type="spellStart"/>
-      <w:r>
-        <w:rPr>
-          <w:sz w:val="20"/>
-          <w:szCs w:val="20"/>
-          <w:lang w:val="en-US"/>
-        </w:rPr>
-        <w:t>Bahamonde’s</w:t>
-      </w:r>
-      <w:proofErr w:type="spellEnd"/>
-      <w:r>
-        <w:rPr>
-          <w:sz w:val="20"/>
-          <w:szCs w:val="20"/>
-          <w:lang w:val="en-US"/>
-        </w:rPr>
-        <w:t xml:space="preserve"> ANID </w:t>
-      </w:r>
-      <w:proofErr w:type="spellStart"/>
+        <w:t xml:space="preserve">) and by Bahamonde’s ANID </w:t>
+      </w:r>
       <w:r>
         <w:rPr>
           <w:i/>
@@ -21162,31 +21124,8 @@
           <w:szCs w:val="20"/>
           <w:lang w:val="en-US"/>
         </w:rPr>
-        <w:t>Fondecyt</w:t>
-      </w:r>
-      <w:proofErr w:type="spellEnd"/>
-      <w:r>
-        <w:rPr>
-          <w:i/>
-          <w:iCs/>
-          <w:sz w:val="20"/>
-          <w:szCs w:val="20"/>
-          <w:lang w:val="en-US"/>
-        </w:rPr>
-        <w:t xml:space="preserve"> </w:t>
-      </w:r>
-      <w:proofErr w:type="spellStart"/>
-      <w:r>
-        <w:rPr>
-          <w:i/>
-          <w:iCs/>
-          <w:sz w:val="20"/>
-          <w:szCs w:val="20"/>
-          <w:lang w:val="en-US"/>
-        </w:rPr>
-        <w:t>Iniciación</w:t>
-      </w:r>
-      <w:proofErr w:type="spellEnd"/>
+        <w:t>Fondecyt Iniciación</w:t>
+      </w:r>
       <w:r>
         <w:rPr>
           <w:sz w:val="20"/>
@@ -21472,25 +21411,7 @@
             <w:szCs w:val="20"/>
             <w:lang w:val="en-US"/>
           </w:rPr>
-          <w:t xml:space="preserve">Scholz &amp; </w:t>
-        </w:r>
-        <w:proofErr w:type="spellStart"/>
-        <w:r>
-          <w:rPr>
-            <w:sz w:val="20"/>
-            <w:szCs w:val="20"/>
-            <w:lang w:val="en-US"/>
-          </w:rPr>
-          <w:t>Sicinski</w:t>
-        </w:r>
-        <w:proofErr w:type="spellEnd"/>
-        <w:r>
-          <w:rPr>
-            <w:sz w:val="20"/>
-            <w:szCs w:val="20"/>
-            <w:lang w:val="en-US"/>
-          </w:rPr>
-          <w:t>, 2015)</w:t>
+          <w:t>Scholz &amp; Sicinski, 2015)</w:t>
         </w:r>
       </w:hyperlink>
       <w:r>
@@ -21593,25 +21514,7 @@
           <w:szCs w:val="20"/>
           <w:lang w:val="en-US"/>
         </w:rPr>
-        <w:t xml:space="preserve">the </w:t>
-      </w:r>
-      <w:proofErr w:type="spellStart"/>
-      <w:r>
-        <w:rPr>
-          <w:sz w:val="20"/>
-          <w:szCs w:val="20"/>
-          <w:lang w:val="en-US"/>
-        </w:rPr>
-        <w:t>Åland</w:t>
-      </w:r>
-      <w:proofErr w:type="spellEnd"/>
-      <w:r>
-        <w:rPr>
-          <w:sz w:val="20"/>
-          <w:szCs w:val="20"/>
-          <w:lang w:val="en-US"/>
-        </w:rPr>
-        <w:t xml:space="preserve"> region </w:t>
+        <w:t xml:space="preserve">the Åland region </w:t>
       </w:r>
       <w:r>
         <w:rPr>
@@ -21861,7 +21764,6 @@
         </w:rPr>
         <w:t xml:space="preserve"> (</w:t>
       </w:r>
-      <w:proofErr w:type="spellStart"/>
       <w:r>
         <w:rPr>
           <w:i/>
@@ -21869,29 +21771,8 @@
           <w:szCs w:val="20"/>
           <w:lang w:val="en-US"/>
         </w:rPr>
-        <w:t>Kielitoimiston</w:t>
-      </w:r>
-      <w:proofErr w:type="spellEnd"/>
-      <w:r>
-        <w:rPr>
-          <w:i/>
-          <w:sz w:val="20"/>
-          <w:szCs w:val="20"/>
-          <w:lang w:val="en-US"/>
-        </w:rPr>
-        <w:t xml:space="preserve"> </w:t>
-      </w:r>
-      <w:proofErr w:type="spellStart"/>
-      <w:r>
-        <w:rPr>
-          <w:i/>
-          <w:sz w:val="20"/>
-          <w:szCs w:val="20"/>
-          <w:lang w:val="en-US"/>
-        </w:rPr>
-        <w:t>sanakirja</w:t>
-      </w:r>
-      <w:proofErr w:type="spellEnd"/>
+        <w:t>Kielitoimiston sanakirja</w:t>
+      </w:r>
       <w:r>
         <w:rPr>
           <w:sz w:val="20"/>
@@ -22093,43 +21974,7 @@
             <w:szCs w:val="20"/>
             <w:lang w:val="en-US"/>
           </w:rPr>
-          <w:t xml:space="preserve">(Berggren et al., 2010, 2017; see also, Price et al., 2011; </w:t>
-        </w:r>
-        <w:proofErr w:type="spellStart"/>
-        <w:r>
-          <w:rPr>
-            <w:sz w:val="20"/>
-            <w:szCs w:val="20"/>
-            <w:lang w:val="en-US"/>
-          </w:rPr>
-          <w:t>Belmi</w:t>
-        </w:r>
-        <w:proofErr w:type="spellEnd"/>
-        <w:r>
-          <w:rPr>
-            <w:sz w:val="20"/>
-            <w:szCs w:val="20"/>
-            <w:lang w:val="en-US"/>
-          </w:rPr>
-          <w:t xml:space="preserve"> &amp; Neale, 2014; </w:t>
-        </w:r>
-        <w:proofErr w:type="spellStart"/>
-        <w:r>
-          <w:rPr>
-            <w:sz w:val="20"/>
-            <w:szCs w:val="20"/>
-            <w:lang w:val="en-US"/>
-          </w:rPr>
-          <w:t>Olivola</w:t>
-        </w:r>
-        <w:proofErr w:type="spellEnd"/>
-        <w:r>
-          <w:rPr>
-            <w:sz w:val="20"/>
-            <w:szCs w:val="20"/>
-            <w:lang w:val="en-US"/>
-          </w:rPr>
-          <w:t xml:space="preserve"> et al., 2018)</w:t>
+          <w:t>(Berggren et al., 2010, 2017; see also, Price et al., 2011; Belmi &amp; Neale, 2014; Olivola et al., 2018)</w:t>
         </w:r>
       </w:hyperlink>
       <w:r>
@@ -22232,25 +22077,7 @@
           <w:szCs w:val="20"/>
           <w:lang w:val="en-US"/>
         </w:rPr>
-        <w:t xml:space="preserve"> overdispersion. To relax the </w:t>
-      </w:r>
-      <w:proofErr w:type="spellStart"/>
-      <w:r>
-        <w:rPr>
-          <w:sz w:val="20"/>
-          <w:szCs w:val="20"/>
-          <w:lang w:val="en-US"/>
-        </w:rPr>
-        <w:t>equidispersion</w:t>
-      </w:r>
-      <w:proofErr w:type="spellEnd"/>
-      <w:r>
-        <w:rPr>
-          <w:sz w:val="20"/>
-          <w:szCs w:val="20"/>
-          <w:lang w:val="en-US"/>
-        </w:rPr>
-        <w:t xml:space="preserve"> assumption, both negative binomial and quasi-Poisson specifications were estimated </w:t>
+        <w:t xml:space="preserve"> overdispersion. To relax the equidispersion assumption, both negative binomial and quasi-Poisson specifications were estimated </w:t>
       </w:r>
       <w:hyperlink r:id="rId10">
         <w:r>

</xml_diff>

<commit_message>
final version sent to Outi
</commit_message>
<xml_diff>
--- a/Bahamonde_Sarpila.docx
+++ b/Bahamonde_Sarpila.docx
@@ -5244,7 +5244,19 @@
         <w:rPr>
           <w:rStyle w:val="Hyperlink2"/>
         </w:rPr>
-        <w:t xml:space="preserve">This strategy might raise a concern about self-selection bias if, e.g., high-status occupations candidates are usually perceived as more attractive; or if, for example, </w:t>
+        <w:t>This strategy might raise a concern about self-selection bias if, e.g.,</w:t>
+      </w:r>
+      <w:r>
+        <w:rPr>
+          <w:rStyle w:val="Hyperlink2"/>
+        </w:rPr>
+        <w:t xml:space="preserve"> </w:t>
+      </w:r>
+      <w:r>
+        <w:rPr>
+          <w:rStyle w:val="Hyperlink2"/>
+        </w:rPr>
+        <w:t xml:space="preserve">high-status occupations candidates are usually perceived as more attractive; or if, for example, </w:t>
       </w:r>
       <w:r>
         <w:rPr>
@@ -7447,7 +7459,19 @@
         <w:rPr>
           <w:rStyle w:val="Hyperlink2"/>
         </w:rPr>
-        <w:t>expectation-states theory, we argue that information about candidates</w:t>
+        <w:t>expectation-states theory, we argue that information about</w:t>
+      </w:r>
+      <w:r>
+        <w:rPr>
+          <w:rStyle w:val="Hyperlink2"/>
+        </w:rPr>
+        <w:t xml:space="preserve"> candidates’ </w:t>
+      </w:r>
+      <w:r>
+        <w:rPr>
+          <w:rStyle w:val="Hyperlink2"/>
+        </w:rPr>
+        <w:t xml:space="preserve">occupations, combined with information about candidates’ physical appearance, function as cues for status that have an effect on voting choices in low-information elections. Specifically, we show that Finnish citizens systematically vote for candidates that look like they have (and do have) upper-class occupations. Our results are rather uncomfortable. Since Finnish society is highly egalitarian, Finland serves as a </w:t>
       </w:r>
       <w:r>
         <w:rPr>
@@ -7456,13 +7480,44 @@
           <w:rtl/>
           <w:lang w:val="ar-SA"/>
         </w:rPr>
-        <w:t xml:space="preserve">’ </w:t>
-      </w:r>
-      <w:r>
-        <w:rPr>
-          <w:rStyle w:val="Hyperlink2"/>
-        </w:rPr>
-        <w:t xml:space="preserve">occupations, combined with information about candidates’ physical appearance, function as cues for status that have an effect on voting choices in low-information elections. Specifically, we show that Finnish citizens systematically vote for candidates that look like they have (and do have) upper-class occupations. Our results are rather uncomfortable. Since Finnish society is highly egalitarian, Finland serves as a </w:t>
+        <w:t>“</w:t>
+      </w:r>
+      <w:r>
+        <w:rPr>
+          <w:rStyle w:val="Hyperlink2"/>
+        </w:rPr>
+        <w:t xml:space="preserve">hard case” for unequal outcomes, improving the inferential leverage of our empirical findings. Also, more than providing an alternative explanation for voting based on physical attractiveness, our results present a complementary mechanism based on occupation-congruent physical appearance and inequality. </w:t>
+      </w:r>
+    </w:p>
+    <w:p>
+      <w:pPr>
+        <w:pStyle w:val="BodyA"/>
+        <w:spacing w:before="200" w:after="200"/>
+        <w:jc w:val="both"/>
+      </w:pPr>
+      <w:r>
+        <w:rPr>
+          <w:rStyle w:val="Hyperlink2"/>
+        </w:rPr>
+        <w:t>Moreover, occupation as one status characteristic interacts with another</w:t>
+      </w:r>
+      <w:r>
+        <w:rPr>
+          <w:rStyle w:val="Hyperlink2"/>
+        </w:rPr>
+        <w:t xml:space="preserve"> social category</w:t>
+      </w:r>
+      <w:r>
+        <w:rPr>
+          <w:rStyle w:val="Hyperlink2"/>
+        </w:rPr>
+        <w:t>, namely, gender</w:t>
+      </w:r>
+      <w:r>
+        <w:rPr>
+          <w:rStyle w:val="Hyperlink2"/>
+        </w:rPr>
+        <w:t xml:space="preserve">. We find that voters particularly penalize female candidates who have a working-class occupation and look like a representative of the working class. In other words, the </w:t>
       </w:r>
       <w:r>
         <w:rPr>
@@ -7477,7 +7532,131 @@
         <w:rPr>
           <w:rStyle w:val="Hyperlink2"/>
         </w:rPr>
-        <w:t xml:space="preserve">hard case” for unequal outcomes, improving the inferential leverage of our empirical findings. Also, more than providing an alternative explanation for voting based on physical attractiveness, our results present a complementary mechanism based on occupation-congruent physical appearance and inequality. </w:t>
+        <w:t xml:space="preserve">double cue of occupational status”—that is, a lower-status occupational title (first cue) combined with a low-status appearance (second cue)—especially concerns women in electoral contexts. These results are in line with previous studies of physical attractiveness and labor-market outcomes, which have shown that for women, the consequences of physical appearance can be much </w:t>
+      </w:r>
+      <w:r>
+        <w:rPr>
+          <w:rStyle w:val="Hyperlink2"/>
+        </w:rPr>
+        <w:t xml:space="preserve">more complex and severe at the same time </w:t>
+      </w:r>
+      <w:hyperlink r:id="rId107" w:history="1">
+        <w:r>
+          <w:rPr>
+            <w:rStyle w:val="Hyperlink2"/>
+          </w:rPr>
+          <w:t>(</w:t>
+        </w:r>
+        <w:proofErr w:type="spellStart"/>
+        <w:r>
+          <w:rPr>
+            <w:rStyle w:val="Hyperlink2"/>
+          </w:rPr>
+          <w:t>Frevert</w:t>
+        </w:r>
+        <w:proofErr w:type="spellEnd"/>
+        <w:r>
+          <w:rPr>
+            <w:rStyle w:val="Hyperlink2"/>
+          </w:rPr>
+          <w:t xml:space="preserve"> &amp; Walker, 2014; </w:t>
+        </w:r>
+        <w:proofErr w:type="spellStart"/>
+        <w:r>
+          <w:rPr>
+            <w:rStyle w:val="Hyperlink2"/>
+          </w:rPr>
+          <w:t>Kuwabara</w:t>
+        </w:r>
+        <w:proofErr w:type="spellEnd"/>
+        <w:r>
+          <w:rPr>
+            <w:rStyle w:val="Hyperlink2"/>
+          </w:rPr>
+          <w:t xml:space="preserve"> &amp; </w:t>
+        </w:r>
+        <w:proofErr w:type="spellStart"/>
+        <w:r>
+          <w:rPr>
+            <w:rStyle w:val="Hyperlink2"/>
+          </w:rPr>
+          <w:t>Thébaud</w:t>
+        </w:r>
+        <w:proofErr w:type="spellEnd"/>
+        <w:r>
+          <w:rPr>
+            <w:rStyle w:val="Hyperlink2"/>
+          </w:rPr>
+          <w:t xml:space="preserve">, 2017; </w:t>
+        </w:r>
+        <w:proofErr w:type="spellStart"/>
+        <w:r>
+          <w:rPr>
+            <w:rStyle w:val="Hyperlink2"/>
+          </w:rPr>
+          <w:t>Kukkonen</w:t>
+        </w:r>
+        <w:proofErr w:type="spellEnd"/>
+        <w:r>
+          <w:rPr>
+            <w:rStyle w:val="Hyperlink2"/>
+          </w:rPr>
+          <w:t xml:space="preserve"> et al., 2023</w:t>
+        </w:r>
+        <w:r>
+          <w:rPr>
+            <w:rStyle w:val="Hyperlink2"/>
+          </w:rPr>
+          <w:t>)</w:t>
+        </w:r>
+      </w:hyperlink>
+      <w:r>
+        <w:rPr>
+          <w:rStyle w:val="Hyperlink2"/>
+        </w:rPr>
+        <w:t xml:space="preserve">. In keeping with our empirical results, past research on voting and physical attractiveness also indicates that appearance matters more for female than for male candidates </w:t>
+      </w:r>
+      <w:hyperlink r:id="rId108" w:history="1">
+        <w:r>
+          <w:rPr>
+            <w:rStyle w:val="Hyperlink2"/>
+          </w:rPr>
+          <w:t>(</w:t>
+        </w:r>
+        <w:proofErr w:type="spellStart"/>
+        <w:r>
+          <w:rPr>
+            <w:rStyle w:val="Hyperlink2"/>
+          </w:rPr>
+          <w:t>Ditonto</w:t>
+        </w:r>
+        <w:proofErr w:type="spellEnd"/>
+        <w:r>
+          <w:rPr>
+            <w:rStyle w:val="Hyperlink2"/>
+          </w:rPr>
+          <w:t xml:space="preserve"> &amp; Mattes, 2018)</w:t>
+        </w:r>
+      </w:hyperlink>
+      <w:r>
+        <w:rPr>
+          <w:rStyle w:val="Hyperlink2"/>
+        </w:rPr>
+        <w:t xml:space="preserve">. Our findings also reveal that as a status characteristic, being male compensates for the negative impact of male candidates’ occupations. This may be related to the fact that in some left-wing parties, being a man and looking like a representative of the working class might serve as an advantage </w:t>
+      </w:r>
+      <w:hyperlink r:id="rId109" w:history="1">
+        <w:r>
+          <w:rPr>
+            <w:rStyle w:val="Hyperlink2"/>
+          </w:rPr>
+          <w:t>(see Berggren et al., 2017)</w:t>
+        </w:r>
+      </w:hyperlink>
+      <w:r>
+        <w:rPr>
+          <w:rStyle w:val="Hyperlink2"/>
+        </w:rPr>
+        <w:t>. Overall, our study suggests that expectation-states theory is a useful theoretical framework for understanding how physical appearance, as a marker of occupational status, may be decisive in elections.</w:t>
       </w:r>
     </w:p>
     <w:p>
@@ -7488,166 +7667,23 @@
       </w:pPr>
       <w:r>
         <w:rPr>
-          <w:rStyle w:val="Hyperlink2"/>
-        </w:rPr>
-        <w:t>Moreover, occupation as one status characteristic interacts with another</w:t>
-      </w:r>
-      <w:r>
-        <w:rPr>
-          <w:rStyle w:val="Hyperlink2"/>
-        </w:rPr>
-        <w:t xml:space="preserve"> social category</w:t>
-      </w:r>
-      <w:r>
-        <w:rPr>
-          <w:rStyle w:val="Hyperlink2"/>
-        </w:rPr>
-        <w:t>, namely, gender</w:t>
-      </w:r>
-      <w:r>
-        <w:rPr>
-          <w:rStyle w:val="Hyperlink2"/>
-        </w:rPr>
-        <w:t xml:space="preserve">. We find that voters particularly penalize female candidates who have a working-class occupation and look like a representative of the working class. In other words, the </w:t>
-      </w:r>
-      <w:r>
-        <w:rPr>
-          <w:rStyle w:val="None"/>
-          <w:rFonts w:ascii="Arial Unicode MS" w:hAnsi="Arial Unicode MS"/>
-          <w:rtl/>
-          <w:lang w:val="ar-SA"/>
-        </w:rPr>
-        <w:t>“</w:t>
-      </w:r>
-      <w:r>
-        <w:rPr>
-          <w:rStyle w:val="Hyperlink2"/>
-        </w:rPr>
-        <w:t xml:space="preserve">double cue of occupational status”—that is, a lower-status occupational title (first cue) combined with a low-status appearance (second cue)— especially concerns women in electoral contexts. These results are in line with previous studies of physical attractiveness and labor-market outcomes, which have shown that for women, the consequences of physical appearance can be much </w:t>
-      </w:r>
-      <w:r>
-        <w:rPr>
-          <w:rStyle w:val="Hyperlink2"/>
-        </w:rPr>
-        <w:t xml:space="preserve">more complex and severe at the same time </w:t>
-      </w:r>
-      <w:hyperlink r:id="rId107" w:history="1">
-        <w:r>
-          <w:rPr>
-            <w:rStyle w:val="Hyperlink2"/>
-          </w:rPr>
-          <w:t>(</w:t>
-        </w:r>
-        <w:proofErr w:type="spellStart"/>
-        <w:r>
-          <w:rPr>
-            <w:rStyle w:val="Hyperlink2"/>
-          </w:rPr>
-          <w:t>Frevert</w:t>
-        </w:r>
-        <w:proofErr w:type="spellEnd"/>
-        <w:r>
-          <w:rPr>
-            <w:rStyle w:val="Hyperlink2"/>
-          </w:rPr>
-          <w:t xml:space="preserve"> &amp; Walker, 2014; </w:t>
-        </w:r>
-        <w:proofErr w:type="spellStart"/>
-        <w:r>
-          <w:rPr>
-            <w:rStyle w:val="Hyperlink2"/>
-          </w:rPr>
-          <w:t>Kuwabara</w:t>
-        </w:r>
-        <w:proofErr w:type="spellEnd"/>
-        <w:r>
-          <w:rPr>
-            <w:rStyle w:val="Hyperlink2"/>
-          </w:rPr>
-          <w:t xml:space="preserve"> &amp; </w:t>
-        </w:r>
-        <w:proofErr w:type="spellStart"/>
-        <w:r>
-          <w:rPr>
-            <w:rStyle w:val="Hyperlink2"/>
-          </w:rPr>
-          <w:t>Thébaud</w:t>
-        </w:r>
-        <w:proofErr w:type="spellEnd"/>
-        <w:r>
-          <w:rPr>
-            <w:rStyle w:val="Hyperlink2"/>
-          </w:rPr>
-          <w:t xml:space="preserve">, 2017; </w:t>
-        </w:r>
-        <w:proofErr w:type="spellStart"/>
-        <w:r>
-          <w:rPr>
-            <w:rStyle w:val="Hyperlink2"/>
-          </w:rPr>
-          <w:t>Kukkonen</w:t>
-        </w:r>
-        <w:proofErr w:type="spellEnd"/>
-        <w:r>
-          <w:rPr>
-            <w:rStyle w:val="Hyperlink2"/>
-          </w:rPr>
-          <w:t xml:space="preserve"> et al., 2023</w:t>
-        </w:r>
-        <w:r>
-          <w:rPr>
-            <w:rStyle w:val="Hyperlink2"/>
-          </w:rPr>
-          <w:t>)</w:t>
-        </w:r>
-      </w:hyperlink>
-      <w:r>
-        <w:rPr>
-          <w:rStyle w:val="Hyperlink2"/>
-        </w:rPr>
-        <w:t xml:space="preserve">. In keeping with our empirical results, past research on voting and physical attractiveness also indicates that appearance matters more for female than for male candidates </w:t>
-      </w:r>
-      <w:hyperlink r:id="rId108" w:history="1">
-        <w:r>
-          <w:rPr>
-            <w:rStyle w:val="Hyperlink2"/>
-          </w:rPr>
-          <w:t>(</w:t>
-        </w:r>
-        <w:proofErr w:type="spellStart"/>
-        <w:r>
-          <w:rPr>
-            <w:rStyle w:val="Hyperlink2"/>
-          </w:rPr>
-          <w:t>Ditonto</w:t>
-        </w:r>
-        <w:proofErr w:type="spellEnd"/>
-        <w:r>
-          <w:rPr>
-            <w:rStyle w:val="Hyperlink2"/>
-          </w:rPr>
-          <w:t xml:space="preserve"> &amp; Mattes, 2018)</w:t>
-        </w:r>
-      </w:hyperlink>
-      <w:r>
-        <w:rPr>
-          <w:rStyle w:val="Hyperlink2"/>
-        </w:rPr>
-        <w:t xml:space="preserve">. Our findings also reveal that as a status characteristic, being male compensates for the negative impact of male candidates’ occupations. This may be related to the fact that in some left-wing parties, being a man and looking like a representative of the working class might serve as an advantage </w:t>
-      </w:r>
-      <w:hyperlink r:id="rId109" w:history="1">
-        <w:r>
-          <w:rPr>
-            <w:rStyle w:val="Hyperlink2"/>
-          </w:rPr>
-          <w:t>(see Berggren et al., 2017)</w:t>
-        </w:r>
-      </w:hyperlink>
-      <w:r>
-        <w:rPr>
-          <w:rStyle w:val="Hyperlink2"/>
-        </w:rPr>
-        <w:t>. Overall, our study suggests that expectation-states theory is a useful theoretical framework for understanding how physical appearance, as a marker of occupational status, may be decisive in elections.</w:t>
+          <w:rStyle w:val="NoneB"/>
+        </w:rPr>
+        <w:t xml:space="preserve">In terms of social inequalities and democracy, the results raise serious concerns. Official statistics show that women and elected representatives with working-class occupations are already underrepresented in municipal councils </w:t>
+      </w:r>
+      <w:hyperlink r:id="rId110" w:history="1">
+        <w:r>
+          <w:rPr>
+            <w:rStyle w:val="NoneB"/>
+          </w:rPr>
+          <w:t>(Official Statistics Finland, 2017)</w:t>
+        </w:r>
+      </w:hyperlink>
+      <w:r>
+        <w:rPr>
+          <w:rStyle w:val="NoneB"/>
+        </w:rPr>
+        <w:t>. At the same time, we showed that the physical appearance of working-class women further lowers their chances of receiving a higher vote count.</w:t>
       </w:r>
     </w:p>
     <w:p>
@@ -7660,33 +7696,6 @@
         <w:rPr>
           <w:rStyle w:val="NoneB"/>
         </w:rPr>
-        <w:t xml:space="preserve">In terms of social inequalities and democracy, the results raise serious concerns. Official statistics show that women and elected representatives with working-class occupations are already underrepresented in municipal councils </w:t>
-      </w:r>
-      <w:hyperlink r:id="rId110" w:history="1">
-        <w:r>
-          <w:rPr>
-            <w:rStyle w:val="NoneB"/>
-          </w:rPr>
-          <w:t>(Official Statistics Finland, 2017)</w:t>
-        </w:r>
-      </w:hyperlink>
-      <w:r>
-        <w:rPr>
-          <w:rStyle w:val="NoneB"/>
-        </w:rPr>
-        <w:t>. At the same time, we showed that the physical appearance of working-class women further lowers their chances of receiving a higher vote count.</w:t>
-      </w:r>
-    </w:p>
-    <w:p>
-      <w:pPr>
-        <w:pStyle w:val="BodyA"/>
-        <w:spacing w:before="200" w:after="200"/>
-        <w:jc w:val="both"/>
-      </w:pPr>
-      <w:r>
-        <w:rPr>
-          <w:rStyle w:val="NoneB"/>
-        </w:rPr>
         <w:t xml:space="preserve">In many ways, our study is explorative, calling </w:t>
       </w:r>
       <w:r>
@@ -7718,14 +7727,7 @@
           <w:rPr>
             <w:rStyle w:val="NoneB"/>
           </w:rPr>
-          <w:t xml:space="preserve">(e.g., </w:t>
-        </w:r>
-        <w:r>
-          <w:rPr>
-            <w:rStyle w:val="NoneB"/>
-          </w:rPr>
-          <w:lastRenderedPageBreak/>
-          <w:t>Evans, 2000)</w:t>
+          <w:t>(e.g., Evans, 2000)</w:t>
         </w:r>
       </w:hyperlink>
       <w:r>
@@ -7738,6 +7740,7 @@
         <w:rPr>
           <w:rStyle w:val="NoneB"/>
         </w:rPr>
+        <w:lastRenderedPageBreak/>
         <w:t xml:space="preserve">Second, </w:t>
       </w:r>
       <w:r>
@@ -15399,13 +15402,7 @@
         <w:rPr>
           <w:rStyle w:val="Hyperlink9"/>
         </w:rPr>
-        <w:t xml:space="preserve"> </w:t>
-      </w:r>
-      <w:r>
-        <w:rPr>
-          <w:rStyle w:val="Hyperlink9"/>
-        </w:rPr>
-        <w:t>We thank one of the reviewers for encouraging this discussion.</w:t>
+        <w:t xml:space="preserve"> We thank one of the reviewers for encouraging this discussion.</w:t>
       </w:r>
     </w:p>
   </w:footnote>

</xml_diff>

<commit_message>
version sent to Outi
</commit_message>
<xml_diff>
--- a/Bahamonde_Sarpila.docx
+++ b/Bahamonde_Sarpila.docx
@@ -1211,144 +1211,65 @@
           <w:rStyle w:val="NoneB"/>
         </w:rPr>
       </w:pPr>
-      <w:ins w:id="8" w:author="Microsoft Office User" w:date="2023-06-16T13:10:00Z">
-        <w:r>
-          <w:rPr>
-            <w:rStyle w:val="NoneB"/>
-          </w:rPr>
-          <w:t>The theoretical framework we introduce is known as "expectation-states theory," which specifically examines how gender, occupation, race, and attractiveness contribute to social inequalities</w:t>
+      <w:r>
+        <w:rPr>
+          <w:rStyle w:val="NoneB"/>
+        </w:rPr>
+        <w:t>The theoretical framework we introduce is known as "expectation-states theory," which specifically examines how gender, occupation, race, and attractiveness contribute to social inequalities</w:t>
+      </w:r>
+      <w:r>
+        <w:rPr>
+          <w:rStyle w:val="NoneB"/>
+        </w:rPr>
+        <w:t xml:space="preserve">. </w:t>
+      </w:r>
+      <w:ins w:id="8" w:author="Microsoft Office User" w:date="2023-06-20T09:14:00Z">
+        <w:r>
+          <w:rPr>
+            <w:rStyle w:val="NoneB"/>
+          </w:rPr>
+          <w:t>The mechanism that generates inequality operates within social interactions. It involves the activation of norms that determine which social groups are deemed more worthy of status and perceived as more capable. This dynamic leads to social discrimination and contributes to the persistence of inequality</w:t>
+        </w:r>
+        <w:r>
+          <w:rPr>
+            <w:rStyle w:val="NoneB"/>
+          </w:rPr>
+          <w:t xml:space="preserve"> </w:t>
         </w:r>
       </w:ins>
-      <w:del w:id="9" w:author="Microsoft Office User" w:date="2023-06-16T13:10:00Z">
-        <w:r>
-          <w:rPr>
-            <w:rStyle w:val="NoneB"/>
-          </w:rPr>
-          <w:delText xml:space="preserve">The </w:delText>
-        </w:r>
-      </w:del>
-      <w:ins w:id="10" w:author="Outi Sarpila" w:date="2023-06-14T14:58:00Z">
-        <w:del w:id="11" w:author="Microsoft Office User" w:date="2023-06-16T13:10:00Z">
-          <w:r>
-            <w:rPr>
-              <w:rStyle w:val="NoneB"/>
-            </w:rPr>
-            <w:delText>literature under</w:delText>
-          </w:r>
-        </w:del>
-      </w:ins>
-      <w:ins w:id="12" w:author="Outi Sarpila" w:date="2023-06-14T15:19:00Z">
-        <w:del w:id="13" w:author="Microsoft Office User" w:date="2023-06-16T13:10:00Z">
-          <w:r>
-            <w:rPr>
-              <w:rStyle w:val="NoneB"/>
-            </w:rPr>
-            <w:delText xml:space="preserve"> </w:delText>
-          </w:r>
-          <w:r>
-            <w:rPr>
-              <w:rStyle w:val="NoneB"/>
-            </w:rPr>
-            <w:delText xml:space="preserve">theoretical framework called </w:delText>
-          </w:r>
-          <w:r>
-            <w:rPr>
-              <w:rStyle w:val="NoneB"/>
-              <w:rtl/>
-            </w:rPr>
-            <w:delText>“</w:delText>
-          </w:r>
-          <w:r>
-            <w:rPr>
-              <w:rStyle w:val="NoneB"/>
-            </w:rPr>
-            <w:delText>expectation-states theory”</w:delText>
-          </w:r>
-        </w:del>
-      </w:ins>
-      <w:ins w:id="14" w:author="Outi Sarpila" w:date="2023-06-14T15:20:00Z">
-        <w:del w:id="15" w:author="Microsoft Office User" w:date="2023-06-16T13:10:00Z">
-          <w:r>
-            <w:rPr>
-              <w:rStyle w:val="NoneB"/>
-            </w:rPr>
-            <w:delText xml:space="preserve">, </w:delText>
-          </w:r>
-        </w:del>
-      </w:ins>
-      <w:del w:id="16" w:author="Microsoft Office User" w:date="2023-06-16T13:10:00Z">
-        <w:r>
-          <w:rPr>
-            <w:rStyle w:val="NoneB"/>
-          </w:rPr>
-          <w:delText>theory pays special attention to how gender, occupation, and race</w:delText>
-        </w:r>
-      </w:del>
-      <w:ins w:id="17" w:author="Outi Sarpila" w:date="2023-06-14T14:57:00Z">
-        <w:del w:id="18" w:author="Microsoft Office User" w:date="2023-06-16T13:10:00Z">
-          <w:r>
-            <w:rPr>
-              <w:rStyle w:val="NoneB"/>
-            </w:rPr>
-            <w:delText xml:space="preserve">, but also attractiveness, </w:delText>
-          </w:r>
-        </w:del>
-      </w:ins>
-      <w:del w:id="19" w:author="Microsoft Office User" w:date="2023-06-16T13:10:00Z">
-        <w:r>
-          <w:rPr>
-            <w:rStyle w:val="NoneB"/>
-          </w:rPr>
-          <w:delText xml:space="preserve"> can translate into social inequalities</w:delText>
-        </w:r>
-      </w:del>
-      <w:r>
-        <w:rPr>
-          <w:rStyle w:val="NoneB"/>
-        </w:rPr>
-        <w:t xml:space="preserve">. The inequality-producing mechanism occurs in social interactions where activation of norms regarding which social groups </w:t>
-      </w:r>
-      <w:ins w:id="20" w:author="Outi Sarpila" w:date="2023-06-19T14:24:00Z">
-        <w:r>
-          <w:rPr>
-            <w:rStyle w:val="NoneB"/>
-          </w:rPr>
-          <w:t xml:space="preserve">are </w:t>
-        </w:r>
-      </w:ins>
-      <w:ins w:id="21" w:author="Outi Sarpila" w:date="2023-06-19T14:23:00Z">
-        <w:r>
-          <w:rPr>
-            <w:rStyle w:val="NoneB"/>
-          </w:rPr>
-          <w:t>believed to be more status worthy</w:t>
-        </w:r>
-      </w:ins>
-      <w:commentRangeStart w:id="22"/>
-      <w:ins w:id="23" w:author="Outi Sarpila" w:date="2023-06-19T13:49:00Z">
-        <w:r>
-          <w:rPr>
-            <w:rStyle w:val="NoneB"/>
-          </w:rPr>
-          <w:t xml:space="preserve">, and thus, </w:t>
-        </w:r>
-      </w:ins>
-      <w:r>
-        <w:rPr>
-          <w:rStyle w:val="NoneB"/>
-        </w:rPr>
-        <w:t xml:space="preserve">are </w:t>
-      </w:r>
-      <w:ins w:id="24" w:author="Outi Sarpila" w:date="2023-06-19T13:50:00Z">
-        <w:r>
-          <w:rPr>
-            <w:rStyle w:val="NoneB"/>
-          </w:rPr>
-          <w:t xml:space="preserve">considered </w:t>
-        </w:r>
-      </w:ins>
-      <w:commentRangeEnd w:id="22"/>
-      <w:ins w:id="25" w:author="Outi Sarpila" w:date="2023-06-19T13:51:00Z">
+      <w:del w:id="9" w:author="Microsoft Office User" w:date="2023-06-20T09:14:00Z">
+        <w:r>
+          <w:rPr>
+            <w:rStyle w:val="NoneB"/>
+          </w:rPr>
+          <w:delText xml:space="preserve">The inequality-producing mechanism occurs in social interactions where activation of norms regarding which social groups </w:delText>
+        </w:r>
+        <w:r>
+          <w:rPr>
+            <w:rStyle w:val="NoneB"/>
+          </w:rPr>
+          <w:delText>are believed to be more status worthy</w:delText>
+        </w:r>
+        <w:commentRangeStart w:id="10"/>
+        <w:r>
+          <w:rPr>
+            <w:rStyle w:val="NoneB"/>
+          </w:rPr>
+          <w:delText xml:space="preserve">, and thus, </w:delText>
+        </w:r>
+        <w:r>
+          <w:rPr>
+            <w:rStyle w:val="NoneB"/>
+          </w:rPr>
+          <w:delText xml:space="preserve">are </w:delText>
+        </w:r>
+        <w:r>
+          <w:rPr>
+            <w:rStyle w:val="NoneB"/>
+          </w:rPr>
+          <w:delText xml:space="preserve">considered </w:delText>
+        </w:r>
+        <w:commentRangeEnd w:id="10"/>
         <w:r>
           <w:rPr>
             <w:rStyle w:val="CommentReference"/>
@@ -1360,15 +1281,15 @@
               <w14:bevel/>
             </w14:textOutline>
           </w:rPr>
-          <w:commentReference w:id="22"/>
-        </w:r>
-      </w:ins>
-      <w:r>
-        <w:rPr>
-          <w:rStyle w:val="NoneB"/>
-        </w:rPr>
-        <w:t xml:space="preserve">more capable takes place, contributing to social discrimination and inequality </w:t>
-      </w:r>
+          <w:commentReference w:id="10"/>
+        </w:r>
+        <w:r>
+          <w:rPr>
+            <w:rStyle w:val="NoneB"/>
+          </w:rPr>
+          <w:delText xml:space="preserve">more capable takes place, contributing to social discrimination and inequality </w:delText>
+        </w:r>
+      </w:del>
       <w:hyperlink r:id="rId23" w:history="1">
         <w:r>
           <w:rPr>
@@ -1388,7 +1309,14 @@
           <w:rPr>
             <w:rStyle w:val="NoneB"/>
           </w:rPr>
-          <w:t xml:space="preserve"> &amp; Ridgeway, 2006; Ridgeway, 2011, 2014; Ridgeway &amp; </w:t>
+          <w:t xml:space="preserve"> &amp; Ridgeway, 2006; Ridgeway, 2011, 2014; </w:t>
+        </w:r>
+        <w:r>
+          <w:rPr>
+            <w:rStyle w:val="NoneB"/>
+          </w:rPr>
+          <w:lastRenderedPageBreak/>
+          <w:t xml:space="preserve">Ridgeway &amp; </w:t>
         </w:r>
         <w:proofErr w:type="spellStart"/>
         <w:r>
@@ -1409,569 +1337,469 @@
         <w:rPr>
           <w:rStyle w:val="NoneB"/>
         </w:rPr>
-        <w:t xml:space="preserve">. </w:t>
-      </w:r>
-      <w:r>
-        <w:rPr>
-          <w:rStyle w:val="NoneB"/>
-        </w:rPr>
-        <w:lastRenderedPageBreak/>
-        <w:t xml:space="preserve">Social norms are shared stereotypes whose significance people actualize in social situations as they combine social categories with </w:t>
-      </w:r>
-      <w:ins w:id="26" w:author="Outi Sarpila" w:date="2023-06-19T13:54:00Z">
-        <w:r>
-          <w:rPr>
-            <w:rStyle w:val="NoneB"/>
+        <w:t xml:space="preserve">. Social norms are shared stereotypes whose significance people actualize in social situations as they combine social categories with </w:t>
+      </w:r>
+      <w:r>
+        <w:rPr>
+          <w:rStyle w:val="NoneB"/>
+        </w:rPr>
+        <w:t>(</w:t>
+      </w:r>
+      <w:r>
+        <w:rPr>
+          <w:rStyle w:val="NoneB"/>
+        </w:rPr>
+        <w:t>e</w:t>
+      </w:r>
+      <w:r>
+        <w:rPr>
+          <w:rStyle w:val="NoneB"/>
+        </w:rPr>
+        <w:t>)</w:t>
+      </w:r>
+      <w:r>
+        <w:rPr>
+          <w:rStyle w:val="NoneB"/>
+        </w:rPr>
+        <w:t>valu</w:t>
+      </w:r>
+      <w:r>
+        <w:rPr>
+          <w:rStyle w:val="NoneB"/>
+        </w:rPr>
+        <w:t>ative</w:t>
+      </w:r>
+      <w:r>
+        <w:rPr>
+          <w:rStyle w:val="NoneB"/>
+        </w:rPr>
+        <w:t xml:space="preserve"> judgments </w:t>
+      </w:r>
+      <w:hyperlink r:id="rId24" w:history="1">
+        <w:r>
+          <w:rPr>
+            <w:rStyle w:val="NoneB"/>
+          </w:rPr>
+          <w:t xml:space="preserve">(Ridgeway, 2011, 2014; Ridgeway &amp; </w:t>
+        </w:r>
+        <w:proofErr w:type="spellStart"/>
+        <w:r>
+          <w:rPr>
+            <w:rStyle w:val="NoneB"/>
+          </w:rPr>
+          <w:t>Correll</w:t>
+        </w:r>
+        <w:proofErr w:type="spellEnd"/>
+        <w:r>
+          <w:rPr>
+            <w:rStyle w:val="NoneB"/>
+          </w:rPr>
+          <w:t>, 2004)</w:t>
+        </w:r>
+      </w:hyperlink>
+      <w:r>
+        <w:rPr>
+          <w:rStyle w:val="NoneB"/>
+        </w:rPr>
+        <w:t xml:space="preserve">. In fact, research shows that physical appearance serves as the main information source for these types of evaluations, particularly in situations where individuals have limited information about the other person (for a review, see Hosoda et al., 2003). </w:t>
+      </w:r>
+      <w:r>
+        <w:rPr>
+          <w:rStyle w:val="NoneB"/>
+        </w:rPr>
+        <w:t>Accordingly, physical attractiveness is similar to other status characteristics, such as gender, race, and occupation, which form the basis for treating people unequally</w:t>
+      </w:r>
+      <w:r>
+        <w:rPr>
+          <w:rStyle w:val="NoneB"/>
+        </w:rPr>
+        <w:t>.</w:t>
+      </w:r>
+      <w:r>
+        <w:rPr>
+          <w:rStyle w:val="NoneB"/>
+        </w:rPr>
+        <w:t xml:space="preserve"> </w:t>
+      </w:r>
+      <w:r>
+        <w:rPr>
+          <w:rStyle w:val="NoneB"/>
+        </w:rPr>
+        <w:t>This holds significant importance as attractive individuals are often perceived as "better" and "more capable" compared to those considered less attractive</w:t>
+      </w:r>
+      <w:r>
+        <w:rPr>
+          <w:rStyle w:val="NoneB"/>
+        </w:rPr>
+        <w:t xml:space="preserve"> (</w:t>
+      </w:r>
+      <w:proofErr w:type="spellStart"/>
+      <w:r>
+        <w:rPr>
+          <w:rStyle w:val="NoneB"/>
+        </w:rPr>
+        <w:t>Frevert</w:t>
+      </w:r>
+      <w:proofErr w:type="spellEnd"/>
+      <w:r>
+        <w:rPr>
+          <w:rStyle w:val="NoneB"/>
+        </w:rPr>
+        <w:t xml:space="preserve"> &amp; Walker, 2014; </w:t>
+      </w:r>
+      <w:proofErr w:type="spellStart"/>
+      <w:r>
+        <w:rPr>
+          <w:rStyle w:val="NoneB"/>
+        </w:rPr>
+        <w:t>Wolbring</w:t>
+      </w:r>
+      <w:proofErr w:type="spellEnd"/>
+      <w:r>
+        <w:rPr>
+          <w:rStyle w:val="NoneB"/>
+        </w:rPr>
+        <w:t xml:space="preserve"> &amp; Riordan, 2016; </w:t>
+      </w:r>
+      <w:proofErr w:type="spellStart"/>
+      <w:r>
+        <w:rPr>
+          <w:rStyle w:val="NoneB"/>
+        </w:rPr>
+        <w:t>Kuwabara</w:t>
+      </w:r>
+      <w:proofErr w:type="spellEnd"/>
+      <w:r>
+        <w:rPr>
+          <w:rStyle w:val="NoneB"/>
+        </w:rPr>
+        <w:t xml:space="preserve"> &amp; </w:t>
+      </w:r>
+      <w:proofErr w:type="spellStart"/>
+      <w:r>
+        <w:rPr>
+          <w:rStyle w:val="NoneB"/>
+        </w:rPr>
+        <w:t>Thébaud</w:t>
+      </w:r>
+      <w:proofErr w:type="spellEnd"/>
+      <w:r>
+        <w:rPr>
+          <w:rStyle w:val="NoneB"/>
+        </w:rPr>
+        <w:t>, 2017; see also Webster &amp; Driskell, 1983, for a review).</w:t>
+      </w:r>
+    </w:p>
+    <w:p>
+      <w:pPr>
+        <w:pStyle w:val="BodyA"/>
+        <w:spacing w:before="200" w:after="200"/>
+        <w:jc w:val="both"/>
+      </w:pPr>
+      <w:r>
+        <w:rPr>
+          <w:rStyle w:val="Hyperlink2"/>
+        </w:rPr>
+        <w:t>In addition,</w:t>
+      </w:r>
+      <w:r>
+        <w:rPr>
+          <w:rStyle w:val="Hyperlink2"/>
+        </w:rPr>
+        <w:t xml:space="preserve"> the title of an occupation </w:t>
+      </w:r>
+      <w:r>
+        <w:rPr>
+          <w:rStyle w:val="Hyperlink13"/>
+        </w:rPr>
+        <w:t>per se</w:t>
+      </w:r>
+      <w:r>
+        <w:rPr>
+          <w:rStyle w:val="Hyperlink2"/>
+        </w:rPr>
+        <w:t xml:space="preserve"> as well as external cues of occupational status also function as status characteristics. In the long tradition of classifying occupations according to prestige </w:t>
+      </w:r>
+      <w:hyperlink r:id="rId25" w:history="1">
+        <w:r>
+          <w:rPr>
+            <w:rStyle w:val="Hyperlink2"/>
           </w:rPr>
           <w:t>(</w:t>
         </w:r>
-      </w:ins>
-      <w:ins w:id="27" w:author="Outi Sarpila" w:date="2023-06-19T13:53:00Z">
-        <w:r>
-          <w:rPr>
-            <w:rStyle w:val="NoneB"/>
-          </w:rPr>
-          <w:t>e</w:t>
-        </w:r>
-      </w:ins>
-      <w:ins w:id="28" w:author="Outi Sarpila" w:date="2023-06-19T13:54:00Z">
-        <w:r>
-          <w:rPr>
-            <w:rStyle w:val="NoneB"/>
-          </w:rPr>
-          <w:t>)</w:t>
-        </w:r>
-      </w:ins>
-      <w:r>
-        <w:rPr>
-          <w:rStyle w:val="NoneB"/>
-        </w:rPr>
-        <w:t>valu</w:t>
-      </w:r>
-      <w:ins w:id="29" w:author="Outi Sarpila" w:date="2023-06-19T13:53:00Z">
-        <w:r>
-          <w:rPr>
-            <w:rStyle w:val="NoneB"/>
-          </w:rPr>
-          <w:t>ative</w:t>
-        </w:r>
-      </w:ins>
-      <w:del w:id="30" w:author="Outi Sarpila" w:date="2023-06-19T13:53:00Z">
-        <w:r>
-          <w:rPr>
-            <w:rStyle w:val="NoneB"/>
-          </w:rPr>
-          <w:delText>e</w:delText>
-        </w:r>
-      </w:del>
-      <w:r>
-        <w:rPr>
-          <w:rStyle w:val="NoneB"/>
-        </w:rPr>
-        <w:t xml:space="preserve"> judgments </w:t>
-      </w:r>
-      <w:hyperlink r:id="rId24" w:history="1">
-        <w:r>
-          <w:rPr>
-            <w:rStyle w:val="NoneB"/>
-          </w:rPr>
-          <w:t xml:space="preserve">(Ridgeway, 2011, 2014; Ridgeway &amp; </w:t>
-        </w:r>
         <w:proofErr w:type="spellStart"/>
         <w:r>
           <w:rPr>
-            <w:rStyle w:val="NoneB"/>
-          </w:rPr>
-          <w:t>Correll</w:t>
+            <w:rStyle w:val="Hyperlink2"/>
+          </w:rPr>
+          <w:t>Treiman</w:t>
         </w:r>
         <w:proofErr w:type="spellEnd"/>
         <w:r>
           <w:rPr>
-            <w:rStyle w:val="NoneB"/>
-          </w:rPr>
-          <w:t>, 2004)</w:t>
-        </w:r>
-      </w:hyperlink>
-      <w:r>
-        <w:rPr>
-          <w:rStyle w:val="NoneB"/>
-        </w:rPr>
-        <w:t xml:space="preserve">. In fact, research shows that physical appearance serves as the main information source for these types of evaluations, particularly in situations where individuals have limited information about the other person (for a review, see Hosoda et al., 2003). </w:t>
-      </w:r>
-      <w:r>
-        <w:rPr>
-          <w:rStyle w:val="NoneB"/>
-        </w:rPr>
-        <w:t>Accordingly, physical attractiveness is similar to other status characteristics, such as gender, race, and occupation, which form the basis for treating people unequally</w:t>
-      </w:r>
-      <w:ins w:id="31" w:author="Microsoft Office User" w:date="2023-06-16T13:16:00Z">
-        <w:r>
-          <w:rPr>
-            <w:rStyle w:val="NoneB"/>
-          </w:rPr>
-          <w:t>.</w:t>
-        </w:r>
-      </w:ins>
-      <w:ins w:id="32" w:author="Outi Sarpila" w:date="2023-06-14T15:02:00Z">
-        <w:r>
-          <w:rPr>
-            <w:rStyle w:val="NoneB"/>
-          </w:rPr>
-          <w:t xml:space="preserve"> </w:t>
-        </w:r>
-      </w:ins>
-      <w:ins w:id="33" w:author="Microsoft Office User" w:date="2023-06-16T13:16:00Z">
-        <w:r>
-          <w:rPr>
-            <w:rStyle w:val="NoneB"/>
-          </w:rPr>
-          <w:t>This holds significant importance as attractive individuals are often perceived as "better" and "more capable" compared to those considered less attractive</w:t>
-        </w:r>
-      </w:ins>
-      <w:ins w:id="34" w:author="Outi Sarpila" w:date="2023-06-14T15:02:00Z">
-        <w:del w:id="35" w:author="Microsoft Office User" w:date="2023-06-16T13:16:00Z">
+            <w:rStyle w:val="Hyperlink2"/>
+          </w:rPr>
+          <w:t>, 1977)</w:t>
+        </w:r>
+      </w:hyperlink>
+      <w:r>
+        <w:rPr>
+          <w:rStyle w:val="Hyperlink2"/>
+        </w:rPr>
+        <w:t xml:space="preserve">, socioeconomic status </w:t>
+      </w:r>
+      <w:hyperlink r:id="rId26" w:history="1">
+        <w:r>
+          <w:rPr>
+            <w:rStyle w:val="Hyperlink2"/>
+          </w:rPr>
+          <w:t>(</w:t>
+        </w:r>
+        <w:proofErr w:type="spellStart"/>
+        <w:r>
+          <w:rPr>
+            <w:rStyle w:val="Hyperlink2"/>
+          </w:rPr>
+          <w:t>Ganzeboom</w:t>
+        </w:r>
+        <w:proofErr w:type="spellEnd"/>
+        <w:r>
+          <w:rPr>
+            <w:rStyle w:val="Hyperlink2"/>
+          </w:rPr>
+          <w:t xml:space="preserve"> et al., 1992)</w:t>
+        </w:r>
+      </w:hyperlink>
+      <w:r>
+        <w:rPr>
+          <w:rStyle w:val="Hyperlink2"/>
+        </w:rPr>
+        <w:t xml:space="preserve">, and social class </w:t>
+      </w:r>
+      <w:hyperlink r:id="rId27" w:history="1">
+        <w:r>
+          <w:rPr>
+            <w:rStyle w:val="Hyperlink2"/>
+          </w:rPr>
+          <w:t>(Erikson &amp; Goldthorpe, 1992)</w:t>
+        </w:r>
+      </w:hyperlink>
+      <w:r>
+        <w:rPr>
+          <w:rStyle w:val="Hyperlink2"/>
+        </w:rPr>
+        <w:t xml:space="preserve">, occupational sorting has been called the </w:t>
+      </w:r>
+      <w:r>
+        <w:rPr>
+          <w:rStyle w:val="None"/>
+          <w:rFonts w:ascii="Arial Unicode MS" w:hAnsi="Arial Unicode MS"/>
+          <w:rtl/>
+          <w:lang w:val="ar-SA"/>
+        </w:rPr>
+        <w:t>“</w:t>
+      </w:r>
+      <w:r>
+        <w:rPr>
+          <w:rStyle w:val="Hyperlink2"/>
+        </w:rPr>
+        <w:t xml:space="preserve">backbone” of stratification research </w:t>
+      </w:r>
+      <w:hyperlink r:id="rId28" w:history="1">
+        <w:r>
+          <w:rPr>
+            <w:rStyle w:val="Hyperlink2"/>
+          </w:rPr>
+          <w:t>(</w:t>
+        </w:r>
+        <w:proofErr w:type="spellStart"/>
+        <w:r>
+          <w:rPr>
+            <w:rStyle w:val="Hyperlink2"/>
+          </w:rPr>
+          <w:t>Ganzeboom</w:t>
+        </w:r>
+        <w:proofErr w:type="spellEnd"/>
+        <w:r>
+          <w:rPr>
+            <w:rStyle w:val="Hyperlink2"/>
+          </w:rPr>
+          <w:t xml:space="preserve"> &amp; </w:t>
+        </w:r>
+        <w:proofErr w:type="spellStart"/>
+        <w:r>
+          <w:rPr>
+            <w:rStyle w:val="Hyperlink2"/>
+          </w:rPr>
+          <w:t>Treiman</w:t>
+        </w:r>
+        <w:proofErr w:type="spellEnd"/>
+        <w:r>
+          <w:rPr>
+            <w:rStyle w:val="Hyperlink2"/>
+          </w:rPr>
+          <w:t>, 1996, p. 202; Rose &amp; Harrison, 2007). Overall, as Rose and Harrison (2007) note</w:t>
+        </w:r>
+      </w:hyperlink>
+      <w:r>
+        <w:rPr>
+          <w:rStyle w:val="Hyperlink2"/>
+        </w:rPr>
+        <w:t xml:space="preserve">, </w:t>
+      </w:r>
+      <w:r>
+        <w:rPr>
+          <w:rStyle w:val="Hyperlink2"/>
+        </w:rPr>
+        <w:t>“</w:t>
+      </w:r>
+      <w:r>
+        <w:rPr>
+          <w:rStyle w:val="Hyperlink2"/>
+        </w:rPr>
+        <w:t xml:space="preserve">[t]he life chances of individuals and families are largely determined by their position in the </w:t>
+      </w:r>
+      <w:proofErr w:type="gramStart"/>
+      <w:r>
+        <w:rPr>
+          <w:rStyle w:val="Hyperlink2"/>
+        </w:rPr>
+        <w:t>market[</w:t>
+      </w:r>
+      <w:proofErr w:type="gramEnd"/>
+      <w:r>
+        <w:rPr>
+          <w:rStyle w:val="Hyperlink2"/>
+        </w:rPr>
+        <w:t xml:space="preserve">,] and occupation is taken to be its central indicator” (p. 460). </w:t>
+      </w:r>
+    </w:p>
+    <w:p>
+      <w:pPr>
+        <w:pStyle w:val="BodyA"/>
+        <w:spacing w:before="200" w:after="200"/>
+        <w:jc w:val="both"/>
+      </w:pPr>
+      <w:r>
+        <w:rPr>
+          <w:rStyle w:val="NoneB"/>
+        </w:rPr>
+        <w:t>A</w:t>
+      </w:r>
+      <w:r>
+        <w:rPr>
+          <w:rStyle w:val="NoneB"/>
+        </w:rPr>
+        <w:t xml:space="preserve"> complementary </w:t>
+      </w:r>
+      <w:r>
+        <w:rPr>
+          <w:rStyle w:val="NoneB"/>
+        </w:rPr>
+        <w:t xml:space="preserve">approach that links physical appearance and inequality is the </w:t>
+      </w:r>
+      <w:proofErr w:type="spellStart"/>
+      <w:r>
+        <w:rPr>
+          <w:rStyle w:val="NoneB"/>
+        </w:rPr>
+        <w:t>Bourdieusian</w:t>
+      </w:r>
+      <w:proofErr w:type="spellEnd"/>
+      <w:r>
+        <w:rPr>
+          <w:rStyle w:val="NoneB"/>
+        </w:rPr>
+        <w:t xml:space="preserve"> approach. </w:t>
+      </w:r>
+      <w:ins w:id="11" w:author="Outi Sarpila" w:date="2023-06-19T14:15:00Z">
+        <w:del w:id="12" w:author="Microsoft Office User" w:date="2023-06-20T09:20:00Z">
           <w:r>
-            <w:rPr>
-              <w:rStyle w:val="NoneB"/>
-            </w:rPr>
-            <w:delText xml:space="preserve">as attractive individuals appear to be </w:delText>
-          </w:r>
-          <w:r>
-            <w:rPr>
-              <w:rStyle w:val="NoneB"/>
-              <w:rtl/>
-            </w:rPr>
-            <w:delText>“</w:delText>
-          </w:r>
-          <w:r>
-            <w:rPr>
-              <w:rStyle w:val="NoneB"/>
-            </w:rPr>
-            <w:delText xml:space="preserve">better” and </w:delText>
-          </w:r>
-          <w:r>
-            <w:rPr>
-              <w:rStyle w:val="NoneB"/>
-              <w:rtl/>
-            </w:rPr>
-            <w:delText>“</w:delText>
-          </w:r>
-          <w:r>
-            <w:rPr>
-              <w:rStyle w:val="NoneB"/>
-            </w:rPr>
-            <w:delText>more capable” than those perceived as less attractive.</w:delText>
-          </w:r>
-        </w:del>
-        <w:r>
-          <w:rPr>
-            <w:rStyle w:val="NoneB"/>
-          </w:rPr>
-          <w:t xml:space="preserve"> </w:t>
-        </w:r>
-      </w:ins>
-      <w:r>
-        <w:rPr>
-          <w:rStyle w:val="NoneB"/>
-        </w:rPr>
-        <w:t xml:space="preserve"> (</w:t>
-      </w:r>
-      <w:proofErr w:type="spellStart"/>
-      <w:r>
-        <w:rPr>
-          <w:rStyle w:val="NoneB"/>
-        </w:rPr>
-        <w:t>Frevert</w:t>
-      </w:r>
-      <w:proofErr w:type="spellEnd"/>
-      <w:r>
-        <w:rPr>
-          <w:rStyle w:val="NoneB"/>
-        </w:rPr>
-        <w:t xml:space="preserve"> &amp; Walker, 2014; </w:t>
-      </w:r>
-      <w:proofErr w:type="spellStart"/>
-      <w:r>
-        <w:rPr>
-          <w:rStyle w:val="NoneB"/>
-        </w:rPr>
-        <w:t>Wolbring</w:t>
-      </w:r>
-      <w:proofErr w:type="spellEnd"/>
-      <w:r>
-        <w:rPr>
-          <w:rStyle w:val="NoneB"/>
-        </w:rPr>
-        <w:t xml:space="preserve"> &amp; Riordan, 2016; </w:t>
-      </w:r>
-      <w:proofErr w:type="spellStart"/>
-      <w:r>
-        <w:rPr>
-          <w:rStyle w:val="NoneB"/>
-        </w:rPr>
-        <w:t>Kuwabara</w:t>
-      </w:r>
-      <w:proofErr w:type="spellEnd"/>
-      <w:r>
-        <w:rPr>
-          <w:rStyle w:val="NoneB"/>
-        </w:rPr>
-        <w:t xml:space="preserve"> &amp; </w:t>
-      </w:r>
-      <w:proofErr w:type="spellStart"/>
-      <w:r>
-        <w:rPr>
-          <w:rStyle w:val="NoneB"/>
-        </w:rPr>
-        <w:t>Thébaud</w:t>
-      </w:r>
-      <w:proofErr w:type="spellEnd"/>
-      <w:r>
-        <w:rPr>
-          <w:rStyle w:val="NoneB"/>
-        </w:rPr>
-        <w:t>, 2017; see also Webster &amp; Driskell, 1983, for a review).</w:t>
-      </w:r>
-    </w:p>
-    <w:p>
-      <w:pPr>
-        <w:pStyle w:val="BodyA"/>
-        <w:spacing w:before="200" w:after="200"/>
-        <w:jc w:val="both"/>
-      </w:pPr>
-      <w:ins w:id="36" w:author="Outi Sarpila" w:date="2023-06-14T15:04:00Z">
-        <w:del w:id="37" w:author="Microsoft Office User" w:date="2023-06-16T13:23:00Z">
-          <w:r>
-            <w:rPr>
-              <w:rStyle w:val="Hyperlink2"/>
-            </w:rPr>
-            <w:delText>But</w:delText>
+            <w:delText>Although</w:delText>
           </w:r>
         </w:del>
       </w:ins>
-      <w:ins w:id="38" w:author="Microsoft Office User" w:date="2023-06-16T13:23:00Z">
-        <w:r>
-          <w:rPr>
-            <w:rStyle w:val="Hyperlink2"/>
-          </w:rPr>
-          <w:t>In addition,</w:t>
+      <w:ins w:id="13" w:author="Microsoft Office User" w:date="2023-06-20T09:23:00Z">
+        <w:r>
+          <w:t>For instance, the occupational title could be used as an indicator of social class, a concept that Bourdieu explored in his research. However, Bourdieu adopted a broader perspective on social classes, considering factors beyond just occupational titles</w:t>
         </w:r>
       </w:ins>
-      <w:r>
-        <w:rPr>
-          <w:rStyle w:val="Hyperlink2"/>
-        </w:rPr>
-        <w:t xml:space="preserve"> the title of an occupation </w:t>
-      </w:r>
-      <w:r>
-        <w:rPr>
-          <w:rStyle w:val="Hyperlink13"/>
-        </w:rPr>
-        <w:t>per se</w:t>
-      </w:r>
-      <w:r>
-        <w:rPr>
-          <w:rStyle w:val="Hyperlink2"/>
-        </w:rPr>
-        <w:t xml:space="preserve"> as well as external cues of occupational status also function as status characteristics. In the long tradition of classifying occupations according to prestige </w:t>
-      </w:r>
-      <w:hyperlink r:id="rId25" w:history="1">
-        <w:r>
-          <w:rPr>
-            <w:rStyle w:val="Hyperlink2"/>
-          </w:rPr>
-          <w:t>(</w:t>
-        </w:r>
-        <w:proofErr w:type="spellStart"/>
-        <w:r>
-          <w:rPr>
-            <w:rStyle w:val="Hyperlink2"/>
-          </w:rPr>
-          <w:t>Treiman</w:t>
-        </w:r>
-        <w:proofErr w:type="spellEnd"/>
-        <w:r>
-          <w:rPr>
-            <w:rStyle w:val="Hyperlink2"/>
-          </w:rPr>
-          <w:t>, 1977)</w:t>
-        </w:r>
-      </w:hyperlink>
-      <w:r>
-        <w:rPr>
-          <w:rStyle w:val="Hyperlink2"/>
-        </w:rPr>
-        <w:t xml:space="preserve">, socioeconomic status </w:t>
-      </w:r>
-      <w:hyperlink r:id="rId26" w:history="1">
-        <w:r>
-          <w:rPr>
-            <w:rStyle w:val="Hyperlink2"/>
-          </w:rPr>
-          <w:t>(</w:t>
-        </w:r>
-        <w:proofErr w:type="spellStart"/>
-        <w:r>
-          <w:rPr>
-            <w:rStyle w:val="Hyperlink2"/>
-          </w:rPr>
-          <w:t>Ganzeboom</w:t>
-        </w:r>
-        <w:proofErr w:type="spellEnd"/>
-        <w:r>
-          <w:rPr>
-            <w:rStyle w:val="Hyperlink2"/>
-          </w:rPr>
-          <w:t xml:space="preserve"> et al., 1992)</w:t>
-        </w:r>
-      </w:hyperlink>
-      <w:r>
-        <w:rPr>
-          <w:rStyle w:val="Hyperlink2"/>
-        </w:rPr>
-        <w:t xml:space="preserve">, and social class </w:t>
-      </w:r>
-      <w:hyperlink r:id="rId27" w:history="1">
-        <w:r>
-          <w:rPr>
-            <w:rStyle w:val="Hyperlink2"/>
-          </w:rPr>
-          <w:t>(Erikson &amp; Goldthorpe, 1992)</w:t>
-        </w:r>
-      </w:hyperlink>
-      <w:r>
-        <w:rPr>
-          <w:rStyle w:val="Hyperlink2"/>
-        </w:rPr>
-        <w:t xml:space="preserve">, occupational sorting has been called the </w:t>
-      </w:r>
-      <w:r>
-        <w:rPr>
-          <w:rStyle w:val="None"/>
-          <w:rFonts w:ascii="Arial Unicode MS" w:hAnsi="Arial Unicode MS"/>
-          <w:rtl/>
-          <w:lang w:val="ar-SA"/>
-        </w:rPr>
-        <w:t>“</w:t>
-      </w:r>
-      <w:r>
-        <w:rPr>
-          <w:rStyle w:val="Hyperlink2"/>
-        </w:rPr>
-        <w:t xml:space="preserve">backbone” of stratification research </w:t>
-      </w:r>
-      <w:hyperlink r:id="rId28" w:history="1">
-        <w:r>
-          <w:rPr>
-            <w:rStyle w:val="Hyperlink2"/>
-          </w:rPr>
-          <w:t>(</w:t>
-        </w:r>
-        <w:proofErr w:type="spellStart"/>
-        <w:r>
-          <w:rPr>
-            <w:rStyle w:val="Hyperlink2"/>
-          </w:rPr>
-          <w:t>Ganzeboom</w:t>
-        </w:r>
-        <w:proofErr w:type="spellEnd"/>
-        <w:r>
-          <w:rPr>
-            <w:rStyle w:val="Hyperlink2"/>
-          </w:rPr>
-          <w:t xml:space="preserve"> &amp; </w:t>
-        </w:r>
-        <w:proofErr w:type="spellStart"/>
-        <w:r>
-          <w:rPr>
-            <w:rStyle w:val="Hyperlink2"/>
-          </w:rPr>
-          <w:t>Treiman</w:t>
-        </w:r>
-        <w:proofErr w:type="spellEnd"/>
-        <w:r>
-          <w:rPr>
-            <w:rStyle w:val="Hyperlink2"/>
-          </w:rPr>
-          <w:t>, 1996, p. 202; Rose &amp; Harrison, 2007). Overall, as Rose and Harrison (2007) note</w:t>
-        </w:r>
-      </w:hyperlink>
-      <w:r>
-        <w:rPr>
-          <w:rStyle w:val="Hyperlink2"/>
-        </w:rPr>
-        <w:t xml:space="preserve">, </w:t>
-      </w:r>
-      <w:r>
-        <w:rPr>
-          <w:rStyle w:val="Hyperlink2"/>
-        </w:rPr>
-        <w:t>“</w:t>
-      </w:r>
-      <w:r>
-        <w:rPr>
-          <w:rStyle w:val="Hyperlink2"/>
-        </w:rPr>
-        <w:t xml:space="preserve">[t]he life chances of individuals and families are largely determined by their position in the </w:t>
-      </w:r>
-      <w:proofErr w:type="gramStart"/>
-      <w:r>
-        <w:rPr>
-          <w:rStyle w:val="Hyperlink2"/>
-        </w:rPr>
-        <w:t>market[</w:t>
-      </w:r>
-      <w:proofErr w:type="gramEnd"/>
-      <w:r>
-        <w:rPr>
-          <w:rStyle w:val="Hyperlink2"/>
-        </w:rPr>
-        <w:t xml:space="preserve">,] and occupation is taken to be its central indicator” (p. 460). </w:t>
-      </w:r>
-    </w:p>
-    <w:p>
-      <w:pPr>
-        <w:pStyle w:val="BodyA"/>
-        <w:spacing w:before="200" w:after="200"/>
-        <w:jc w:val="both"/>
-      </w:pPr>
-      <w:r>
-        <w:rPr>
-          <w:rStyle w:val="NoneB"/>
-        </w:rPr>
-        <w:t>A</w:t>
-      </w:r>
-      <w:r>
-        <w:rPr>
-          <w:rStyle w:val="NoneB"/>
-        </w:rPr>
-        <w:t xml:space="preserve"> complementary </w:t>
-      </w:r>
-      <w:r>
-        <w:rPr>
-          <w:rStyle w:val="NoneB"/>
-        </w:rPr>
-        <w:t xml:space="preserve">approach that links physical appearance and inequality is the </w:t>
+      <w:ins w:id="14" w:author="Outi Sarpila" w:date="2023-06-19T14:15:00Z">
+        <w:del w:id="15" w:author="Microsoft Office User" w:date="2023-06-20T09:23:00Z">
+          <w:r>
+            <w:delText xml:space="preserve"> the occupational title </w:delText>
+          </w:r>
+        </w:del>
+      </w:ins>
+      <w:ins w:id="16" w:author="Outi Sarpila" w:date="2023-06-19T14:16:00Z">
+        <w:del w:id="17" w:author="Microsoft Office User" w:date="2023-06-20T09:20:00Z">
+          <w:r>
+            <w:delText xml:space="preserve">can </w:delText>
+          </w:r>
+        </w:del>
+      </w:ins>
+      <w:ins w:id="18" w:author="Outi Sarpila" w:date="2023-06-19T14:15:00Z">
+        <w:del w:id="19" w:author="Microsoft Office User" w:date="2023-06-20T09:23:00Z">
+          <w:r>
+            <w:delText xml:space="preserve">serve as a proxy for social class (which Bourdieu </w:delText>
+          </w:r>
+        </w:del>
+        <w:del w:id="20" w:author="Microsoft Office User" w:date="2023-06-20T09:20:00Z">
+          <w:r>
+            <w:delText xml:space="preserve">himself </w:delText>
+          </w:r>
+        </w:del>
+        <w:del w:id="21" w:author="Microsoft Office User" w:date="2023-06-20T09:23:00Z">
+          <w:r>
+            <w:delText xml:space="preserve">also </w:delText>
+          </w:r>
+        </w:del>
+        <w:del w:id="22" w:author="Microsoft Office User" w:date="2023-06-20T09:20:00Z">
+          <w:r>
+            <w:delText xml:space="preserve">used </w:delText>
+          </w:r>
+        </w:del>
+        <w:del w:id="23" w:author="Microsoft Office User" w:date="2023-06-20T09:23:00Z">
+          <w:r>
+            <w:delText xml:space="preserve">in his </w:delText>
+          </w:r>
+        </w:del>
+        <w:del w:id="24" w:author="Microsoft Office User" w:date="2023-06-20T09:20:00Z">
+          <w:r>
+            <w:delText>empirical analyses</w:delText>
+          </w:r>
+        </w:del>
+        <w:del w:id="25" w:author="Microsoft Office User" w:date="2023-06-20T09:23:00Z">
+          <w:r>
+            <w:delText>), Bourdieu approached social classes more broadly than just through occupational titles</w:delText>
+          </w:r>
+        </w:del>
+        <w:r>
+          <w:t>.</w:t>
+        </w:r>
+        <w:r>
+          <w:t xml:space="preserve"> </w:t>
+        </w:r>
+      </w:ins>
+      <w:r>
+        <w:rPr>
+          <w:rStyle w:val="NoneB"/>
+        </w:rPr>
+        <w:t xml:space="preserve">According to this framework, social classes are based on different types of capital: economic capital (e.g., wealth and income), cultural capital (e.g., educational qualifications, attitudes toward art, culture, clothing, and physical appearance), and social capital (e.g., social relations), the composition and volume of which varies from one social class to another (Bourdieu, 1984, 1986). Thus, for example, the upper class might comprise individuals with relatively higher levels of cultural capital but not excessive incomes (e.g., professors), as well as people with higher incomes but not necessarily much formal education (e.g., successful entrepreneurs; </w:t>
       </w:r>
       <w:proofErr w:type="spellStart"/>
       <w:r>
         <w:rPr>
           <w:rStyle w:val="NoneB"/>
         </w:rPr>
-        <w:t>Bourdieusian</w:t>
+        <w:t>Flemmen</w:t>
       </w:r>
       <w:proofErr w:type="spellEnd"/>
       <w:r>
         <w:rPr>
           <w:rStyle w:val="NoneB"/>
         </w:rPr>
-        <w:t xml:space="preserve"> approach. </w:t>
-      </w:r>
-      <w:ins w:id="39" w:author="Outi Sarpila" w:date="2023-06-19T14:15:00Z">
-        <w:r>
-          <w:t xml:space="preserve">Although the occupational title </w:t>
-        </w:r>
-      </w:ins>
-      <w:ins w:id="40" w:author="Outi Sarpila" w:date="2023-06-19T14:16:00Z">
-        <w:r>
-          <w:t xml:space="preserve">can </w:t>
-        </w:r>
-      </w:ins>
-      <w:ins w:id="41" w:author="Outi Sarpila" w:date="2023-06-19T14:15:00Z">
-        <w:r>
-          <w:t>serve as a proxy for social class (which Bourdieu himself also used in his empirical analyses), Bourdieu approached social classes more broadly than just through occupational titles.</w:t>
-        </w:r>
-        <w:r>
-          <w:t xml:space="preserve"> </w:t>
-        </w:r>
-      </w:ins>
-      <w:r>
-        <w:rPr>
-          <w:rStyle w:val="NoneB"/>
-        </w:rPr>
-        <w:t xml:space="preserve">According to this framework, social classes are based on different types of capital: economic capital (e.g., wealth and income), cultural capital (e.g., educational qualifications, attitudes toward art, culture, clothing, and physical appearance), and social capital (e.g., social relations), the composition and volume of which varies from one social class to another (Bourdieu, 1984, 1986). Thus, for example, the upper class might comprise individuals with relatively higher levels of cultural capital but not excessive incomes (e.g., professors), as well as people with higher incomes but not necessarily much formal education (e.g., successful entrepreneurs; </w:t>
-      </w:r>
-      <w:proofErr w:type="spellStart"/>
-      <w:r>
-        <w:rPr>
-          <w:rStyle w:val="NoneB"/>
-        </w:rPr>
-        <w:t>Flemmen</w:t>
-      </w:r>
-      <w:proofErr w:type="spellEnd"/>
-      <w:r>
-        <w:rPr>
-          <w:rStyle w:val="NoneB"/>
-        </w:rPr>
-        <w:t xml:space="preserve"> et al., 2017). </w:t>
-      </w:r>
-      <w:commentRangeStart w:id="42"/>
-      <w:commentRangeStart w:id="43"/>
-      <w:commentRangeStart w:id="44"/>
-      <w:commentRangeStart w:id="45"/>
-      <w:r>
-        <w:rPr>
-          <w:rStyle w:val="NoneB"/>
-        </w:rPr>
-        <w:t xml:space="preserve">Even more importantly, Bourdieu emphasized the embodied nature of social class: clothing and physical appearance can provide social markers that sort different social classes, according to how individuals dress and look (Bourdieu, 1984). </w:t>
-      </w:r>
-      <w:commentRangeEnd w:id="42"/>
-      <w:del w:id="46" w:author="Outi Sarpila" w:date="2023-06-19T14:13:00Z">
-        <w:r>
-          <w:rPr>
-            <w:rStyle w:val="CommentReference"/>
-            <w:rFonts w:ascii="Times New Roman" w:hAnsi="Times New Roman" w:cs="Times New Roman"/>
-            <w:color w:val="auto"/>
-            <w14:textOutline w14:w="0" w14:cap="rnd" w14:cmpd="sng" w14:algn="ctr">
-              <w14:noFill/>
-              <w14:prstDash w14:val="solid"/>
-              <w14:bevel/>
-            </w14:textOutline>
-          </w:rPr>
-          <w:commentReference w:id="42"/>
-        </w:r>
-        <w:commentRangeEnd w:id="43"/>
-        <w:r>
-          <w:rPr>
-            <w:rStyle w:val="CommentReference"/>
-            <w:rFonts w:ascii="Times New Roman" w:hAnsi="Times New Roman" w:cs="Times New Roman"/>
-            <w:color w:val="auto"/>
-            <w14:textOutline w14:w="0" w14:cap="rnd" w14:cmpd="sng" w14:algn="ctr">
-              <w14:noFill/>
-              <w14:prstDash w14:val="solid"/>
-              <w14:bevel/>
-            </w14:textOutline>
-          </w:rPr>
-          <w:commentReference w:id="43"/>
-        </w:r>
-        <w:commentRangeEnd w:id="44"/>
-        <w:r>
-          <w:rPr>
-            <w:rStyle w:val="CommentReference"/>
-            <w:rFonts w:ascii="Times New Roman" w:hAnsi="Times New Roman" w:cs="Times New Roman"/>
-            <w:color w:val="auto"/>
-            <w14:textOutline w14:w="0" w14:cap="rnd" w14:cmpd="sng" w14:algn="ctr">
-              <w14:noFill/>
-              <w14:prstDash w14:val="solid"/>
-              <w14:bevel/>
-            </w14:textOutline>
-          </w:rPr>
-          <w:commentReference w:id="44"/>
-        </w:r>
-      </w:del>
-      <w:commentRangeEnd w:id="45"/>
-      <w:r>
-        <w:rPr>
-          <w:rStyle w:val="CommentReference"/>
-          <w:rFonts w:ascii="Times New Roman" w:hAnsi="Times New Roman" w:cs="Times New Roman"/>
-          <w:color w:val="auto"/>
-          <w14:textOutline w14:w="0" w14:cap="rnd" w14:cmpd="sng" w14:algn="ctr">
-            <w14:noFill/>
-            <w14:prstDash w14:val="solid"/>
-            <w14:bevel/>
-          </w14:textOutline>
-        </w:rPr>
-        <w:commentReference w:id="45"/>
+        <w:t xml:space="preserve"> et al., 2017). Even more importantly, Bourdieu emphasized the embodied nature of social class: clothing and physical appearance can provide social markers that sort different social classes, according to how individuals dress and look (Bourdieu, 1984). </w:t>
       </w:r>
     </w:p>
     <w:p>
@@ -3624,8 +3452,8 @@
         <w:spacing w:before="200" w:after="200"/>
         <w:jc w:val="both"/>
       </w:pPr>
-      <w:bookmarkStart w:id="47" w:name="_headingh.3znysh7"/>
-      <w:bookmarkEnd w:id="47"/>
+      <w:bookmarkStart w:id="26" w:name="_headingh.3znysh7"/>
+      <w:bookmarkEnd w:id="26"/>
       <w:r>
         <w:rPr>
           <w:rStyle w:val="NoneB"/>
@@ -3639,8 +3467,8 @@
         <w:spacing w:before="200" w:after="200"/>
         <w:jc w:val="both"/>
       </w:pPr>
-      <w:bookmarkStart w:id="48" w:name="_headingh.2et92p0"/>
-      <w:bookmarkEnd w:id="48"/>
+      <w:bookmarkStart w:id="27" w:name="_headingh.2et92p0"/>
+      <w:bookmarkEnd w:id="27"/>
       <w:r>
         <w:rPr>
           <w:rStyle w:val="Hyperlink2"/>
@@ -4039,8 +3867,8 @@
         <w:spacing w:before="200" w:after="200"/>
         <w:jc w:val="both"/>
       </w:pPr>
-      <w:bookmarkStart w:id="49" w:name="_headingh.ibwfcvy5ekyq"/>
-      <w:bookmarkEnd w:id="49"/>
+      <w:bookmarkStart w:id="28" w:name="_headingh.ibwfcvy5ekyq"/>
+      <w:bookmarkEnd w:id="28"/>
       <w:r>
         <w:rPr>
           <w:rStyle w:val="NoneB"/>
@@ -4230,8 +4058,8 @@
         <w:spacing w:before="200" w:after="200"/>
         <w:jc w:val="both"/>
       </w:pPr>
-      <w:bookmarkStart w:id="50" w:name="_headingh.tyjcwt"/>
-      <w:bookmarkEnd w:id="50"/>
+      <w:bookmarkStart w:id="29" w:name="_headingh.tyjcwt"/>
+      <w:bookmarkEnd w:id="29"/>
       <w:r>
         <w:rPr>
           <w:rStyle w:val="NoneB"/>
@@ -5473,59 +5301,57 @@
         <w:spacing w:before="200" w:after="200"/>
         <w:jc w:val="center"/>
       </w:pPr>
-      <w:ins w:id="51" w:author="Microsoft Office User" w:date="2023-06-16T13:52:00Z">
-        <w:r>
-          <w:rPr>
-            <w:noProof/>
-            <w14:textOutline w14:w="0" w14:cap="rnd" w14:cmpd="sng" w14:algn="ctr">
-              <w14:noFill/>
-              <w14:prstDash w14:val="solid"/>
-              <w14:bevel/>
-            </w14:textOutline>
-          </w:rPr>
-          <w:drawing>
-            <wp:inline distT="0" distB="0" distL="0" distR="0" wp14:anchorId="2BB1C467" wp14:editId="4C56ED94">
-              <wp:extent cx="4892040" cy="5365516"/>
-              <wp:effectExtent l="0" t="0" r="0" b="0"/>
-              <wp:docPr id="464247169" name="Picture 1"/>
-              <wp:cNvGraphicFramePr>
-                <a:graphicFrameLocks xmlns:a="http://schemas.openxmlformats.org/drawingml/2006/main" noChangeAspect="1"/>
-              </wp:cNvGraphicFramePr>
-              <a:graphic xmlns:a="http://schemas.openxmlformats.org/drawingml/2006/main">
-                <a:graphicData uri="http://schemas.openxmlformats.org/drawingml/2006/picture">
-                  <pic:pic xmlns:pic="http://schemas.openxmlformats.org/drawingml/2006/picture">
-                    <pic:nvPicPr>
-                      <pic:cNvPr id="464247169" name="Picture 464247169"/>
-                      <pic:cNvPicPr/>
-                    </pic:nvPicPr>
-                    <pic:blipFill>
-                      <a:blip r:embed="rId79" cstate="print">
-                        <a:extLst>
-                          <a:ext uri="{28A0092B-C50C-407E-A947-70E740481C1C}">
-                            <a14:useLocalDpi xmlns:a14="http://schemas.microsoft.com/office/drawing/2010/main" val="0"/>
-                          </a:ext>
-                        </a:extLst>
-                      </a:blip>
-                      <a:stretch>
-                        <a:fillRect/>
-                      </a:stretch>
-                    </pic:blipFill>
-                    <pic:spPr>
-                      <a:xfrm>
-                        <a:off x="0" y="0"/>
-                        <a:ext cx="4926683" cy="5403512"/>
-                      </a:xfrm>
-                      <a:prstGeom prst="rect">
-                        <a:avLst/>
-                      </a:prstGeom>
-                    </pic:spPr>
-                  </pic:pic>
-                </a:graphicData>
-              </a:graphic>
-            </wp:inline>
-          </w:drawing>
-        </w:r>
-      </w:ins>
+      <w:r>
+        <w:rPr>
+          <w:noProof/>
+          <w14:textOutline w14:w="0" w14:cap="rnd" w14:cmpd="sng" w14:algn="ctr">
+            <w14:noFill/>
+            <w14:prstDash w14:val="solid"/>
+            <w14:bevel/>
+          </w14:textOutline>
+        </w:rPr>
+        <w:drawing>
+          <wp:inline distT="0" distB="0" distL="0" distR="0" wp14:anchorId="2BB1C467" wp14:editId="4C56ED94">
+            <wp:extent cx="4892040" cy="5365516"/>
+            <wp:effectExtent l="0" t="0" r="0" b="0"/>
+            <wp:docPr id="464247169" name="Picture 1"/>
+            <wp:cNvGraphicFramePr>
+              <a:graphicFrameLocks xmlns:a="http://schemas.openxmlformats.org/drawingml/2006/main" noChangeAspect="1"/>
+            </wp:cNvGraphicFramePr>
+            <a:graphic xmlns:a="http://schemas.openxmlformats.org/drawingml/2006/main">
+              <a:graphicData uri="http://schemas.openxmlformats.org/drawingml/2006/picture">
+                <pic:pic xmlns:pic="http://schemas.openxmlformats.org/drawingml/2006/picture">
+                  <pic:nvPicPr>
+                    <pic:cNvPr id="464247169" name="Picture 464247169"/>
+                    <pic:cNvPicPr/>
+                  </pic:nvPicPr>
+                  <pic:blipFill>
+                    <a:blip r:embed="rId79" cstate="print">
+                      <a:extLst>
+                        <a:ext uri="{28A0092B-C50C-407E-A947-70E740481C1C}">
+                          <a14:useLocalDpi xmlns:a14="http://schemas.microsoft.com/office/drawing/2010/main" val="0"/>
+                        </a:ext>
+                      </a:extLst>
+                    </a:blip>
+                    <a:stretch>
+                      <a:fillRect/>
+                    </a:stretch>
+                  </pic:blipFill>
+                  <pic:spPr>
+                    <a:xfrm>
+                      <a:off x="0" y="0"/>
+                      <a:ext cx="4926683" cy="5403512"/>
+                    </a:xfrm>
+                    <a:prstGeom prst="rect">
+                      <a:avLst/>
+                    </a:prstGeom>
+                  </pic:spPr>
+                </pic:pic>
+              </a:graphicData>
+            </a:graphic>
+          </wp:inline>
+        </w:drawing>
+      </w:r>
     </w:p>
     <w:p>
       <w:pPr>
@@ -5614,7 +5440,7 @@
             <wp:extent cx="3646759" cy="3646759"/>
             <wp:effectExtent l="0" t="0" r="0" b="0"/>
             <wp:wrapTopAndBottom distT="152400" distB="152400"/>
-            <wp:docPr id="1073741826" name="Picture 2" descr="balance.jpg"/>
+            <wp:docPr id="1073741826" name="officeArt object" descr="balance.jpg"/>
             <wp:cNvGraphicFramePr/>
             <a:graphic xmlns:a="http://schemas.openxmlformats.org/drawingml/2006/main">
               <a:graphicData uri="http://schemas.openxmlformats.org/drawingml/2006/picture">
@@ -5843,8 +5669,8 @@
         <w:spacing w:before="200" w:after="200"/>
         <w:jc w:val="both"/>
       </w:pPr>
-      <w:bookmarkStart w:id="52" w:name="_headingh.3dy6vkm"/>
-      <w:bookmarkEnd w:id="52"/>
+      <w:bookmarkStart w:id="30" w:name="_headingh.3dy6vkm"/>
+      <w:bookmarkEnd w:id="30"/>
       <w:r>
         <w:rPr>
           <w:rStyle w:val="Hyperlink2"/>
@@ -6151,7 +5977,7 @@
                     <wp:lineTo x="0" y="0"/>
                   </wp:wrapPolygon>
                 </wp:wrapThrough>
-                <wp:docPr id="1073741827" name="Text Box 3" descr="(1)"/>
+                <wp:docPr id="1073741827" name="officeArt object" descr="(1)"/>
                 <wp:cNvGraphicFramePr/>
                 <a:graphic xmlns:a="http://schemas.openxmlformats.org/drawingml/2006/main">
                   <a:graphicData uri="http://schemas.microsoft.com/office/word/2010/wordprocessingShape">
@@ -6202,7 +6028,7 @@
                 <v:stroke joinstyle="miter"/>
                 <v:path gradientshapeok="t" o:connecttype="rect"/>
               </v:shapetype>
-              <v:shape id="Text Box 3" o:spid="_x0000_s1026" type="#_x0000_t202" alt="(1)" style="position:absolute;left:0;text-align:left;margin-left:501.05pt;margin-top:48.15pt;width:21.45pt;height:18.25pt;z-index:251661312;visibility:visible;mso-wrap-style:square;mso-wrap-distance-left:12pt;mso-wrap-distance-top:12pt;mso-wrap-distance-right:12pt;mso-wrap-distance-bottom:12pt;mso-position-horizontal:absolute;mso-position-horizontal-relative:page;mso-position-vertical:absolute;mso-position-vertical-relative:line;v-text-anchor:top" wrapcoords="-50 0 21550 0 21550 21541 -50 21541 -50 0" o:gfxdata="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" filled="f" stroked="f" strokeweight="1pt">
+              <v:shape id="officeArt object" o:spid="_x0000_s1026" type="#_x0000_t202" alt="(1)" style="position:absolute;left:0;text-align:left;margin-left:501.05pt;margin-top:48.15pt;width:21.45pt;height:18.25pt;z-index:251661312;visibility:visible;mso-wrap-style:square;mso-wrap-distance-left:12pt;mso-wrap-distance-top:12pt;mso-wrap-distance-right:12pt;mso-wrap-distance-bottom:12pt;mso-position-horizontal:absolute;mso-position-horizontal-relative:page;mso-position-vertical:absolute;mso-position-vertical-relative:line;v-text-anchor:top" wrapcoords="-50 0 21550 0 21550 21541 -50 21541 -50 0" o:gfxdata="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" filled="f" stroked="f" strokeweight="1pt">
                 <v:stroke miterlimit="4"/>
                 <v:textbox inset="1.2699mm,1.2699mm,1.2699mm,1.2699mm">
                   <w:txbxContent>
@@ -6244,7 +6070,7 @@
           <wp:inline distT="0" distB="0" distL="0" distR="0" wp14:anchorId="20626DB1" wp14:editId="7B16DDA3">
             <wp:extent cx="5065732" cy="1291762"/>
             <wp:effectExtent l="0" t="0" r="0" b="0"/>
-            <wp:docPr id="1073741828" name="Picture 4" descr="W9PZe54etwtMJq7xKmIk50s8glwFXB5_v72RJfnvt5DzI_nvWX9JSIQAXC_Zwe_sW2bwjnqJqe_A8b3l-9SXgiCUicWWUEYMQyPH_kfw6Y2r3ZwDOpXNGgc8yVu1YCdrOMagpbUYtixD.png"/>
+            <wp:docPr id="1073741828" name="officeArt object" descr="W9PZe54etwtMJq7xKmIk50s8glwFXB5_v72RJfnvt5DzI_nvWX9JSIQAXC_Zwe_sW2bwjnqJqe_A8b3l-9SXgiCUicWWUEYMQyPH_kfw6Y2r3ZwDOpXNGgc8yVu1YCdrOMagpbUYtixD.png"/>
             <wp:cNvGraphicFramePr/>
             <a:graphic xmlns:a="http://schemas.openxmlformats.org/drawingml/2006/main">
               <a:graphicData uri="http://schemas.openxmlformats.org/drawingml/2006/picture">
@@ -6995,8 +6821,8 @@
         <w:spacing w:before="200" w:after="200"/>
         <w:jc w:val="both"/>
       </w:pPr>
-      <w:bookmarkStart w:id="55" w:name="_headingh.1t3h5sf"/>
-      <w:bookmarkEnd w:id="55"/>
+      <w:bookmarkStart w:id="31" w:name="_headingh.1t3h5sf"/>
+      <w:bookmarkEnd w:id="31"/>
       <w:r>
         <w:rPr>
           <w:rStyle w:val="Hyperlink2"/>
@@ -7199,7 +7025,7 @@
             <wp:extent cx="5727700" cy="2863850"/>
             <wp:effectExtent l="0" t="0" r="0" b="0"/>
             <wp:wrapTopAndBottom distT="152400" distB="152400"/>
-            <wp:docPr id="1073741829" name="Picture 5" descr="pred_prob_plot.jpeg"/>
+            <wp:docPr id="1073741829" name="officeArt object" descr="pred_prob_plot.jpeg"/>
             <wp:cNvGraphicFramePr/>
             <a:graphic xmlns:a="http://schemas.openxmlformats.org/drawingml/2006/main">
               <a:graphicData uri="http://schemas.openxmlformats.org/drawingml/2006/picture">
@@ -7321,7 +7147,7 @@
           <wp:inline distT="0" distB="0" distL="0" distR="0" wp14:anchorId="7E8C1EC1" wp14:editId="6084DAB5">
             <wp:extent cx="5727573" cy="1897259"/>
             <wp:effectExtent l="0" t="0" r="0" b="0"/>
-            <wp:docPr id="1073741830" name="Picture 6" descr="5-NP_rvfRJd8D3PT-APh_zQeVLYT1al9sdhd99dQZ_u4AhpCfI43Kg6-XR5uJzixZMRdj5lK_xmtLuNWe_eWI4t0jFUqb22iy5od5a3MhNPYl6BeJ6Sc-wwyyvxrCqNLz3liqd6zvdLoKPFyZdBvpA.png"/>
+            <wp:docPr id="1073741830" name="officeArt object" descr="5-NP_rvfRJd8D3PT-APh_zQeVLYT1al9sdhd99dQZ_u4AhpCfI43Kg6-XR5uJzixZMRdj5lK_xmtLuNWe_eWI4t0jFUqb22iy5od5a3MhNPYl6BeJ6Sc-wwyyvxrCqNLz3liqd6zvdLoKPFyZdBvpA.png"/>
             <wp:cNvGraphicFramePr/>
             <a:graphic xmlns:a="http://schemas.openxmlformats.org/drawingml/2006/main">
               <a:graphicData uri="http://schemas.openxmlformats.org/drawingml/2006/picture">
@@ -7419,7 +7245,7 @@
           <wp:inline distT="0" distB="0" distL="0" distR="0" wp14:anchorId="63C730B0" wp14:editId="6BA3AF18">
             <wp:extent cx="5727573" cy="1925897"/>
             <wp:effectExtent l="0" t="0" r="0" b="0"/>
-            <wp:docPr id="1073741831" name="Picture 7" descr="GBoeVHIRVzQPYYmZlvswyyyAsFFrJ8OhnsyczS5l-hDPXfe1UeIseo5SDDHlq7MEJexua83dzVU8C1QicGfVNhN9SL8pZYWp9Th5JJ9vH_c0QZRc86xhRCp5elbVNil6WtM6P9WtoTKa5IuSoCaUyw.png"/>
+            <wp:docPr id="1073741831" name="officeArt object" descr="GBoeVHIRVzQPYYmZlvswyyyAsFFrJ8OhnsyczS5l-hDPXfe1UeIseo5SDDHlq7MEJexua83dzVU8C1QicGfVNhN9SL8pZYWp9Th5JJ9vH_c0QZRc86xhRCp5elbVNil6WtM6P9WtoTKa5IuSoCaUyw.png"/>
             <wp:cNvGraphicFramePr/>
             <a:graphic xmlns:a="http://schemas.openxmlformats.org/drawingml/2006/main">
               <a:graphicData uri="http://schemas.openxmlformats.org/drawingml/2006/picture">
@@ -7478,8 +7304,8 @@
         <w:spacing w:before="200" w:after="200"/>
         <w:jc w:val="both"/>
       </w:pPr>
-      <w:bookmarkStart w:id="56" w:name="_headingh.4d34og8"/>
-      <w:bookmarkEnd w:id="56"/>
+      <w:bookmarkStart w:id="32" w:name="_headingh.4d34og8"/>
+      <w:bookmarkEnd w:id="32"/>
       <w:r>
         <w:rPr>
           <w:rStyle w:val="Hyperlink2"/>
@@ -7837,8 +7663,8 @@
         <w:spacing w:before="200" w:after="200"/>
         <w:jc w:val="both"/>
       </w:pPr>
-      <w:bookmarkStart w:id="57" w:name="_headingh.2s8eyo1"/>
-      <w:bookmarkEnd w:id="57"/>
+      <w:bookmarkStart w:id="33" w:name="_headingh.2s8eyo1"/>
+      <w:bookmarkEnd w:id="33"/>
       <w:r>
         <w:rPr>
           <w:rStyle w:val="Hyperlink2"/>
@@ -14617,7 +14443,7 @@
       </w:r>
     </w:p>
   </w:comment>
-  <w:comment w:id="22" w:author="Outi Sarpila" w:date="2023-06-19T13:51:00Z" w:initials="OS">
+  <w:comment w:id="10" w:author="Outi Sarpila" w:date="2023-06-19T13:51:00Z" w:initials="OS">
     <w:p>
       <w:r>
         <w:rPr>
@@ -14634,140 +14460,6 @@
         <w:t xml:space="preserve">The word status is critical here in terms of inequality producing mechanism so added it </w:t>
       </w:r>
     </w:p>
-  </w:comment>
-  <w:comment w:id="42" w:author="Microsoft Office User" w:date="2023-06-16T13:26:00Z" w:initials="MOU">
-    <w:p>
-      <w:pPr>
-        <w:pStyle w:val="CommentText"/>
-        <w:rPr>
-          <w:rStyle w:val="NoneB"/>
-        </w:rPr>
-      </w:pPr>
-      <w:r>
-        <w:rPr>
-          <w:rStyle w:val="CommentReference"/>
-        </w:rPr>
-        <w:annotationRef/>
-      </w:r>
-      <w:r>
-        <w:t xml:space="preserve">Outi: How about combining the first and second sentences? The first one is all about </w:t>
-      </w:r>
-      <w:r>
-        <w:rPr>
-          <w:rStyle w:val="NoneB"/>
-        </w:rPr>
-        <w:t>clothing and physical appearance, while the second one is about occupational titles. I propose:</w:t>
-      </w:r>
-      <w:r>
-        <w:rPr>
-          <w:rStyle w:val="NoneB"/>
-        </w:rPr>
-        <w:br/>
-      </w:r>
-    </w:p>
-    <w:p>
-      <w:pPr>
-        <w:pStyle w:val="CommentText"/>
-      </w:pPr>
-      <w:r>
-        <w:rPr>
-          <w:rStyle w:val="NoneB"/>
-        </w:rPr>
-        <w:t xml:space="preserve">“Even more importantly, Bourdieu emphasized the embodied nature of social class: clothing, </w:t>
-      </w:r>
-      <w:r>
-        <w:rPr>
-          <w:b/>
-          <w:bCs/>
-        </w:rPr>
-        <w:t>occupational title</w:t>
-      </w:r>
-      <w:r>
-        <w:rPr>
-          <w:rStyle w:val="NoneB"/>
-        </w:rPr>
-        <w:t xml:space="preserve"> and physical appearance can provide social markers that sort different social classes, according to how individuals dress and look (Bourdieu, 1984).”</w:t>
-      </w:r>
-      <w:r>
-        <w:rPr>
-          <w:rStyle w:val="NoneB"/>
-        </w:rPr>
-        <w:br/>
-      </w:r>
-      <w:r>
-        <w:rPr>
-          <w:rStyle w:val="NoneB"/>
-        </w:rPr>
-        <w:br/>
-        <w:t>^ But I’m not sure if Bourdieu (1984) did look at occupational titles.</w:t>
-      </w:r>
-      <w:r>
-        <w:rPr>
-          <w:rStyle w:val="NoneB"/>
-        </w:rPr>
-        <w:br/>
-      </w:r>
-    </w:p>
-  </w:comment>
-  <w:comment w:id="43" w:author="Outi Sarpila" w:date="2023-06-19T14:05:00Z" w:initials="OS">
-    <w:p>
-      <w:r>
-        <w:rPr>
-          <w:rStyle w:val="CommentReference"/>
-        </w:rPr>
-        <w:annotationRef/>
-      </w:r>
-      <w:r>
-        <w:rPr>
-          <w:color w:val="000000"/>
-          <w:sz w:val="20"/>
-          <w:szCs w:val="20"/>
-        </w:rPr>
-        <w:t>Thank’s for the suggestion but I would not combine these two:D</w:t>
-      </w:r>
-    </w:p>
-  </w:comment>
-  <w:comment w:id="44" w:author="Outi Sarpila" w:date="2023-06-19T14:06:00Z" w:initials="OS">
-    <w:p>
-      <w:r>
-        <w:rPr>
-          <w:rStyle w:val="CommentReference"/>
-        </w:rPr>
-        <w:annotationRef/>
-      </w:r>
-      <w:r>
-        <w:rPr>
-          <w:color w:val="000000"/>
-          <w:sz w:val="20"/>
-          <w:szCs w:val="20"/>
-        </w:rPr>
-        <w:t>Because occupational title is not embodied.</w:t>
-      </w:r>
-    </w:p>
-  </w:comment>
-  <w:comment w:id="45" w:author="Outi Sarpila" w:date="2023-06-19T14:16:00Z" w:initials="OS">
-    <w:p>
-      <w:r>
-        <w:rPr>
-          <w:rStyle w:val="CommentReference"/>
-        </w:rPr>
-        <w:annotationRef/>
-      </w:r>
-      <w:r>
-        <w:rPr>
-          <w:color w:val="374051"/>
-          <w:sz w:val="20"/>
-          <w:szCs w:val="20"/>
-          <w:highlight w:val="white"/>
-        </w:rPr>
-        <w:t>I moved the matter concerning the occupational title higher to a section where it may be better linked. Does it work better now?</w:t>
-      </w:r>
-    </w:p>
-    <w:p/>
-    <w:p/>
-    <w:p/>
-    <w:p/>
-    <w:p/>
   </w:comment>
 </w:comments>
 </file>
@@ -14776,11 +14468,7 @@
 <w15:commentsEx xmlns:wpc="http://schemas.microsoft.com/office/word/2010/wordprocessingCanvas" xmlns:cx="http://schemas.microsoft.com/office/drawing/2014/chartex" xmlns:cx1="http://schemas.microsoft.com/office/drawing/2015/9/8/chartex" xmlns:cx2="http://schemas.microsoft.com/office/drawing/2015/10/21/chartex" xmlns:cx3="http://schemas.microsoft.com/office/drawing/2016/5/9/chartex" xmlns:cx4="http://schemas.microsoft.com/office/drawing/2016/5/10/chartex" xmlns:cx5="http://schemas.microsoft.com/office/drawing/2016/5/11/chartex" xmlns:cx6="http://schemas.microsoft.com/office/drawing/2016/5/12/chartex" xmlns:cx7="http://schemas.microsoft.com/office/drawing/2016/5/13/chartex" xmlns:cx8="http://schemas.microsoft.com/office/drawing/2016/5/14/chartex" xmlns:mc="http://schemas.openxmlformats.org/markup-compatibility/2006" xmlns:aink="http://schemas.microsoft.com/office/drawing/2016/ink" xmlns:am3d="http://schemas.microsoft.com/office/drawing/2017/model3d" xmlns:o="urn:schemas-microsoft-com:office:office" xmlns:oel="http://schemas.microsoft.com/office/2019/extlst" xmlns:r="http://schemas.openxmlformats.org/officeDocument/2006/relationships" xmlns:m="http://schemas.openxmlformats.org/officeDocument/2006/math" xmlns:v="urn:schemas-microsoft-com:vml" xmlns:wp14="http://schemas.microsoft.com/office/word/2010/wordprocessingDrawing" xmlns:wp="http://schemas.openxmlformats.org/drawingml/2006/wordprocessingDrawing" xmlns:w10="urn:schemas-microsoft-com:office:word" xmlns:w="http://schemas.openxmlformats.org/wordprocessingml/2006/main" xmlns:w14="http://schemas.microsoft.com/office/word/2010/wordml" xmlns:w15="http://schemas.microsoft.com/office/word/2012/wordml" xmlns:w16cex="http://schemas.microsoft.com/office/word/2018/wordml/cex" xmlns:w16cid="http://schemas.microsoft.com/office/word/2016/wordml/cid" xmlns:w16="http://schemas.microsoft.com/office/word/2018/wordml" xmlns:w16sdtdh="http://schemas.microsoft.com/office/word/2020/wordml/sdtdatahash" xmlns:w16se="http://schemas.microsoft.com/office/word/2015/wordml/symex" xmlns:wpg="http://schemas.microsoft.com/office/word/2010/wordprocessingGroup" xmlns:wpi="http://schemas.microsoft.com/office/word/2010/wordprocessingInk" xmlns:wne="http://schemas.microsoft.com/office/word/2006/wordml" xmlns:wps="http://schemas.microsoft.com/office/word/2010/wordprocessingShape" mc:Ignorable="w14 w15 w16se w16cid w16 w16cex w16sdtdh wp14">
   <w15:commentEx w15:paraId="323F13B7" w15:done="1"/>
   <w15:commentEx w15:paraId="53BD3DE9" w15:paraIdParent="323F13B7" w15:done="1"/>
-  <w15:commentEx w15:paraId="6CE9F4BF" w15:done="0"/>
-  <w15:commentEx w15:paraId="6BDAFEB5" w15:done="0"/>
-  <w15:commentEx w15:paraId="2A478E70" w15:paraIdParent="6BDAFEB5" w15:done="0"/>
-  <w15:commentEx w15:paraId="346E5208" w15:paraIdParent="6BDAFEB5" w15:done="0"/>
-  <w15:commentEx w15:paraId="4EFD621A" w15:paraIdParent="6BDAFEB5" w15:done="0"/>
+  <w15:commentEx w15:paraId="6CE9F4BF" w15:done="1"/>
 </w15:commentsEx>
 </file>
 
@@ -14789,10 +14477,6 @@
   <w16cex:commentExtensible w16cex:durableId="2836DA0B" w16cex:dateUtc="2023-06-16T09:54:00Z"/>
   <w16cex:commentExtensible w16cex:durableId="283AE2AC" w16cex:dateUtc="2023-06-19T11:20:00Z"/>
   <w16cex:commentExtensible w16cex:durableId="283ADBD8" w16cex:dateUtc="2023-06-19T10:51:00Z"/>
-  <w16cex:commentExtensible w16cex:durableId="2836E17B" w16cex:dateUtc="2023-06-16T10:26:00Z"/>
-  <w16cex:commentExtensible w16cex:durableId="283ADF24" w16cex:dateUtc="2023-06-19T11:05:00Z"/>
-  <w16cex:commentExtensible w16cex:durableId="283ADF60" w16cex:dateUtc="2023-06-19T11:06:00Z"/>
-  <w16cex:commentExtensible w16cex:durableId="283AE1A7" w16cex:dateUtc="2023-06-19T11:16:00Z"/>
 </w16cex:commentsExtensible>
 </file>
 
@@ -14801,10 +14485,6 @@
   <w16cid:commentId w16cid:paraId="323F13B7" w16cid:durableId="2836DA0B"/>
   <w16cid:commentId w16cid:paraId="53BD3DE9" w16cid:durableId="283AE2AC"/>
   <w16cid:commentId w16cid:paraId="6CE9F4BF" w16cid:durableId="283ADBD8"/>
-  <w16cid:commentId w16cid:paraId="6BDAFEB5" w16cid:durableId="2836E17B"/>
-  <w16cid:commentId w16cid:paraId="2A478E70" w16cid:durableId="283ADF24"/>
-  <w16cid:commentId w16cid:paraId="346E5208" w16cid:durableId="283ADF60"/>
-  <w16cid:commentId w16cid:paraId="4EFD621A" w16cid:durableId="283AE1A7"/>
 </w16cid:commentsIds>
 </file>
 
@@ -16043,124 +15723,12 @@
         </w:rPr>
         <w:t xml:space="preserve"> Party frequency is as follows: </w:t>
       </w:r>
-      <w:ins w:id="53" w:author="Microsoft Office User" w:date="2023-06-16T13:46:00Z">
-        <w:r>
-          <w:rPr>
-            <w:rStyle w:val="Hyperlink9"/>
-          </w:rPr>
-          <w:t>KD (Christian Democrats, N=271), KESK (Centre Party, N=54), KOK (National Coalition Party, N=113), PS (Finns Party, N=508), RKP (Swedish People's Party, N=141), SDP (Social Democratic Party, N=141), VAS (Left Alliance, N=103), VIHR (Green League, N=54), Others (PIR-Communist Party of Finland and SKP-Pirate Party, N=4)</w:t>
-        </w:r>
-      </w:ins>
-      <w:del w:id="54" w:author="Microsoft Office User" w:date="2023-06-16T13:46:00Z">
-        <w:r>
-          <w:rPr>
-            <w:rStyle w:val="Hyperlink9"/>
-          </w:rPr>
-          <w:delText>KD</w:delText>
-        </w:r>
-        <w:r>
-          <w:rPr>
-            <w:rStyle w:val="Hyperlink9"/>
-          </w:rPr>
-          <w:delText>: Christian Democrats</w:delText>
-        </w:r>
-        <w:r>
-          <w:rPr>
-            <w:rStyle w:val="Hyperlink9"/>
-          </w:rPr>
-          <w:delText xml:space="preserve"> (271), KESK</w:delText>
-        </w:r>
-        <w:r>
-          <w:rPr>
-            <w:rStyle w:val="Hyperlink9"/>
-          </w:rPr>
-          <w:delText>: Centre Party</w:delText>
-        </w:r>
-        <w:r>
-          <w:rPr>
-            <w:rStyle w:val="Hyperlink9"/>
-          </w:rPr>
-          <w:delText xml:space="preserve"> (54), KOK</w:delText>
-        </w:r>
-        <w:r>
-          <w:rPr>
-            <w:rStyle w:val="Hyperlink9"/>
-          </w:rPr>
-          <w:delText>: National Coalition Party</w:delText>
-        </w:r>
-        <w:r>
-          <w:rPr>
-            <w:rStyle w:val="Hyperlink9"/>
-          </w:rPr>
-          <w:delText xml:space="preserve"> (113), PS</w:delText>
-        </w:r>
-        <w:r>
-          <w:rPr>
-            <w:rStyle w:val="Hyperlink9"/>
-          </w:rPr>
-          <w:delText>: Finns Party</w:delText>
-        </w:r>
-        <w:r>
-          <w:rPr>
-            <w:rStyle w:val="Hyperlink9"/>
-          </w:rPr>
-          <w:delText xml:space="preserve"> (508), RKP</w:delText>
-        </w:r>
-        <w:r>
-          <w:rPr>
-            <w:rStyle w:val="Hyperlink9"/>
-          </w:rPr>
-          <w:delText>: Swedish People’s Party</w:delText>
-        </w:r>
-        <w:r>
-          <w:rPr>
-            <w:rStyle w:val="Hyperlink9"/>
-          </w:rPr>
-          <w:delText xml:space="preserve"> (141), SDP</w:delText>
-        </w:r>
-        <w:r>
-          <w:rPr>
-            <w:rStyle w:val="Hyperlink9"/>
-          </w:rPr>
-          <w:delText>: Social Democratic Party</w:delText>
-        </w:r>
-        <w:r>
-          <w:rPr>
-            <w:rStyle w:val="Hyperlink9"/>
-          </w:rPr>
-          <w:delText xml:space="preserve"> (141), VAS</w:delText>
-        </w:r>
-        <w:r>
-          <w:rPr>
-            <w:rStyle w:val="Hyperlink9"/>
-          </w:rPr>
-          <w:delText>: Left Alliance</w:delText>
-        </w:r>
-        <w:r>
-          <w:rPr>
-            <w:rStyle w:val="Hyperlink9"/>
-          </w:rPr>
-          <w:delText xml:space="preserve"> (103), VIHR</w:delText>
-        </w:r>
-        <w:r>
-          <w:rPr>
-            <w:rStyle w:val="Hyperlink9"/>
-          </w:rPr>
-          <w:delText xml:space="preserve">: Green League </w:delText>
-        </w:r>
-        <w:r>
-          <w:rPr>
-            <w:rStyle w:val="Hyperlink9"/>
-          </w:rPr>
-          <w:delText>(54)</w:delText>
-        </w:r>
-        <w:r>
-          <w:rPr>
-            <w:rStyle w:val="Hyperlink9"/>
-          </w:rPr>
-          <w:delText>, others include PIR + SKP: Communist Party of Finland + Pirate Party (4)</w:delText>
-        </w:r>
-      </w:del>
+      <w:r>
+        <w:rPr>
+          <w:rStyle w:val="Hyperlink9"/>
+        </w:rPr>
+        <w:t>KD (Christian Democrats, N=271), KESK (Centre Party, N=54), KOK (National Coalition Party, N=113), PS (Finns Party, N=508), RKP (Swedish People's Party, N=141), SDP (Social Democratic Party, N=141), VAS (Left Alliance, N=103), VIHR (Green League, N=54), Others (PIR-Communist Party of Finland and SKP-Pirate Party, N=4)</w:t>
+      </w:r>
       <w:r>
         <w:rPr>
           <w:rStyle w:val="Hyperlink9"/>

</xml_diff>

<commit_message>
final version subm to journal
</commit_message>
<xml_diff>
--- a/Bahamonde_Sarpila.docx
+++ b/Bahamonde_Sarpila.docx
@@ -14687,7 +14687,23 @@
           <w:sz w:val="18"/>
           <w:szCs w:val="18"/>
         </w:rPr>
-        <w:t>, number 11220303.</w:t>
+        <w:t xml:space="preserve"> </w:t>
+      </w:r>
+      <w:r>
+        <w:rPr>
+          <w:rFonts w:cs="Arial"/>
+          <w:sz w:val="18"/>
+          <w:szCs w:val="18"/>
+        </w:rPr>
+        <w:t>(decision number 11220303)</w:t>
+      </w:r>
+      <w:r>
+        <w:rPr>
+          <w:rFonts w:cs="Arial"/>
+          <w:sz w:val="18"/>
+          <w:szCs w:val="18"/>
+        </w:rPr>
+        <w:t>.</w:t>
       </w:r>
     </w:p>
   </w:footnote>

</xml_diff>